<commit_message>
tablas informe apartado 4
</commit_message>
<xml_diff>
--- a/02_2526_MemoriaGrp34.docx
+++ b/02_2526_MemoriaGrp34.docx
@@ -24910,14 +24910,397 @@
     </w:p>
     <w:tbl>
       <w:tblPr>
-        <w:tblStyle w:val="Tablanormal"/>
+        <w:tblStyle w:val="Tablaconcuadrcula"/>
+        <w:tblW w:w="0" w:type="auto"/>
+        <w:tblLook w:val="06A0" w:firstRow="1" w:lastRow="0" w:firstColumn="1" w:lastColumn="0" w:noHBand="1" w:noVBand="1"/>
+      </w:tblPr>
+      <w:tblGrid>
+        <w:gridCol w:w="4245"/>
+        <w:gridCol w:w="4245"/>
+      </w:tblGrid>
+      <w:tr>
+        <w:trPr>
+          <w:trHeight w:val="300"/>
+        </w:trPr>
+        <w:tc>
+          <w:tcPr>
+            <w:tcW w:w="4245" w:type="dxa"/>
+            <w:tcMar/>
+          </w:tcPr>
+          <w:p>
+            <w:pPr>
+              <w:spacing w:before="0" w:beforeAutospacing="off" w:after="0" w:afterAutospacing="off"/>
+              <w:jc w:val="center"/>
+            </w:pPr>
+            <w:r>
+              <w:rPr>
+                <w:b w:val="1"/>
+                <w:bCs w:val="1"/>
+              </w:rPr>
+              <w:t>Métrica</w:t>
+            </w:r>
+          </w:p>
+        </w:tc>
+        <w:tc>
+          <w:tcPr>
+            <w:tcW w:w="4245" w:type="dxa"/>
+            <w:tcMar/>
+          </w:tcPr>
+          <w:p>
+            <w:pPr>
+              <w:spacing w:before="0" w:beforeAutospacing="off" w:after="0" w:afterAutospacing="off"/>
+              <w:jc w:val="center"/>
+            </w:pPr>
+            <w:r>
+              <w:rPr>
+                <w:b w:val="1"/>
+                <w:bCs w:val="1"/>
+              </w:rPr>
+              <w:t>Resultado</w:t>
+            </w:r>
+          </w:p>
+        </w:tc>
+      </w:tr>
+      <w:tr>
+        <w:trPr>
+          <w:trHeight w:val="300"/>
+        </w:trPr>
+        <w:tc>
+          <w:tcPr>
+            <w:tcW w:w="4245" w:type="dxa"/>
+            <w:tcMar/>
+          </w:tcPr>
+          <w:p>
+            <w:pPr>
+              <w:spacing w:before="0" w:beforeAutospacing="off" w:after="0" w:afterAutospacing="off"/>
+            </w:pPr>
+            <w:r>
+              <w:rPr/>
+              <w:t>Historias de usuario planificadas</w:t>
+            </w:r>
+          </w:p>
+        </w:tc>
+        <w:tc>
+          <w:tcPr>
+            <w:tcW w:w="4245" w:type="dxa"/>
+            <w:tcMar/>
+          </w:tcPr>
+          <w:p>
+            <w:pPr>
+              <w:spacing w:before="0" w:beforeAutospacing="off" w:after="0" w:afterAutospacing="off"/>
+            </w:pPr>
+            <w:r>
+              <w:rPr/>
+              <w:t>5</w:t>
+            </w:r>
+          </w:p>
+        </w:tc>
+      </w:tr>
+      <w:tr>
+        <w:trPr>
+          <w:trHeight w:val="300"/>
+        </w:trPr>
+        <w:tc>
+          <w:tcPr>
+            <w:tcW w:w="4245" w:type="dxa"/>
+            <w:tcMar/>
+          </w:tcPr>
+          <w:p>
+            <w:pPr>
+              <w:spacing w:before="0" w:beforeAutospacing="off" w:after="0" w:afterAutospacing="off"/>
+            </w:pPr>
+            <w:r>
+              <w:rPr/>
+              <w:t>Historias de usuario entregadas</w:t>
+            </w:r>
+          </w:p>
+        </w:tc>
+        <w:tc>
+          <w:tcPr>
+            <w:tcW w:w="4245" w:type="dxa"/>
+            <w:tcMar/>
+          </w:tcPr>
+          <w:p>
+            <w:pPr>
+              <w:spacing w:before="0" w:beforeAutospacing="off" w:after="0" w:afterAutospacing="off"/>
+            </w:pPr>
+            <w:r>
+              <w:rPr/>
+              <w:t>5</w:t>
+            </w:r>
+          </w:p>
+        </w:tc>
+      </w:tr>
+      <w:tr>
+        <w:trPr>
+          <w:trHeight w:val="300"/>
+        </w:trPr>
+        <w:tc>
+          <w:tcPr>
+            <w:tcW w:w="4245" w:type="dxa"/>
+            <w:tcMar/>
+          </w:tcPr>
+          <w:p>
+            <w:pPr>
+              <w:spacing w:before="0" w:beforeAutospacing="off" w:after="0" w:afterAutospacing="off"/>
+            </w:pPr>
+            <w:r>
+              <w:rPr/>
+              <w:t>Porcentaje de historias completadas</w:t>
+            </w:r>
+          </w:p>
+        </w:tc>
+        <w:tc>
+          <w:tcPr>
+            <w:tcW w:w="4245" w:type="dxa"/>
+            <w:tcMar/>
+          </w:tcPr>
+          <w:p>
+            <w:pPr>
+              <w:spacing w:before="0" w:beforeAutospacing="off" w:after="0" w:afterAutospacing="off"/>
+            </w:pPr>
+            <w:r>
+              <w:rPr/>
+              <w:t>100%</w:t>
+            </w:r>
+          </w:p>
+        </w:tc>
+      </w:tr>
+      <w:tr>
+        <w:trPr>
+          <w:trHeight w:val="300"/>
+        </w:trPr>
+        <w:tc>
+          <w:tcPr>
+            <w:tcW w:w="4245" w:type="dxa"/>
+            <w:tcMar/>
+          </w:tcPr>
+          <w:p>
+            <w:pPr>
+              <w:spacing w:before="0" w:beforeAutospacing="off" w:after="0" w:afterAutospacing="off"/>
+            </w:pPr>
+            <w:r>
+              <w:rPr/>
+              <w:t>Fallos funcionales abiertos al cierre</w:t>
+            </w:r>
+          </w:p>
+        </w:tc>
+        <w:tc>
+          <w:tcPr>
+            <w:tcW w:w="4245" w:type="dxa"/>
+            <w:tcMar/>
+          </w:tcPr>
+          <w:p>
+            <w:pPr>
+              <w:spacing w:before="0" w:beforeAutospacing="off" w:after="0" w:afterAutospacing="off"/>
+            </w:pPr>
+            <w:r>
+              <w:rPr/>
+              <w:t>0</w:t>
+            </w:r>
+          </w:p>
+        </w:tc>
+      </w:tr>
+      <w:tr>
+        <w:trPr>
+          <w:trHeight w:val="300"/>
+        </w:trPr>
+        <w:tc>
+          <w:tcPr>
+            <w:tcW w:w="4245" w:type="dxa"/>
+            <w:tcMar/>
+          </w:tcPr>
+          <w:p>
+            <w:pPr>
+              <w:spacing w:before="0" w:beforeAutospacing="off" w:after="0" w:afterAutospacing="off"/>
+            </w:pPr>
+            <w:r>
+              <w:rPr/>
+              <w:t>Nivel principal de prueba</w:t>
+            </w:r>
+          </w:p>
+        </w:tc>
+        <w:tc>
+          <w:tcPr>
+            <w:tcW w:w="4245" w:type="dxa"/>
+            <w:tcMar/>
+          </w:tcPr>
+          <w:p>
+            <w:pPr>
+              <w:spacing w:before="0" w:beforeAutospacing="off" w:after="0" w:afterAutospacing="off"/>
+            </w:pPr>
+            <w:r>
+              <w:rPr/>
+              <w:t>Unidad</w:t>
+            </w:r>
+          </w:p>
+        </w:tc>
+      </w:tr>
+      <w:tr>
+        <w:trPr>
+          <w:trHeight w:val="300"/>
+        </w:trPr>
+        <w:tc>
+          <w:tcPr>
+            <w:tcW w:w="4245" w:type="dxa"/>
+            <w:tcMar/>
+          </w:tcPr>
+          <w:p>
+            <w:pPr>
+              <w:spacing w:before="0" w:beforeAutospacing="off" w:after="0" w:afterAutospacing="off"/>
+            </w:pPr>
+            <w:r>
+              <w:rPr/>
+              <w:t>Pruebas de integración aplicadas</w:t>
+            </w:r>
+          </w:p>
+        </w:tc>
+        <w:tc>
+          <w:tcPr>
+            <w:tcW w:w="4245" w:type="dxa"/>
+            <w:tcMar/>
+          </w:tcPr>
+          <w:p>
+            <w:pPr>
+              <w:spacing w:before="0" w:beforeAutospacing="off" w:after="0" w:afterAutospacing="off"/>
+            </w:pPr>
+            <w:r>
+              <w:rPr/>
+              <w:t>Sí, en DAOs con clases colaboradoras</w:t>
+            </w:r>
+          </w:p>
+        </w:tc>
+      </w:tr>
+      <w:tr>
+        <w:trPr>
+          <w:trHeight w:val="300"/>
+        </w:trPr>
+        <w:tc>
+          <w:tcPr>
+            <w:tcW w:w="4245" w:type="dxa"/>
+            <w:tcMar/>
+          </w:tcPr>
+          <w:p>
+            <w:pPr>
+              <w:spacing w:before="0" w:beforeAutospacing="off" w:after="0" w:afterAutospacing="off"/>
+            </w:pPr>
+            <w:r>
+              <w:rPr/>
+              <w:t>Técnica principal</w:t>
+            </w:r>
+          </w:p>
+        </w:tc>
+        <w:tc>
+          <w:tcPr>
+            <w:tcW w:w="4245" w:type="dxa"/>
+            <w:tcMar/>
+          </w:tcPr>
+          <w:p>
+            <w:pPr>
+              <w:spacing w:before="0" w:beforeAutospacing="off" w:after="0" w:afterAutospacing="off"/>
+            </w:pPr>
+            <w:r>
+              <w:rPr/>
+              <w:t>Caja Negra — Clases de Equivalencia</w:t>
+            </w:r>
+          </w:p>
+        </w:tc>
+      </w:tr>
+      <w:tr>
+        <w:trPr>
+          <w:trHeight w:val="300"/>
+        </w:trPr>
+        <w:tc>
+          <w:tcPr>
+            <w:tcW w:w="4245" w:type="dxa"/>
+            <w:tcMar/>
+          </w:tcPr>
+          <w:p>
+            <w:pPr>
+              <w:spacing w:before="0" w:beforeAutospacing="off" w:after="0" w:afterAutospacing="off"/>
+            </w:pPr>
+            <w:r>
+              <w:rPr/>
+              <w:t>Técnica complementaria</w:t>
+            </w:r>
+          </w:p>
+        </w:tc>
+        <w:tc>
+          <w:tcPr>
+            <w:tcW w:w="4245" w:type="dxa"/>
+            <w:tcMar/>
+          </w:tcPr>
+          <w:p>
+            <w:pPr>
+              <w:spacing w:before="0" w:beforeAutospacing="off" w:after="0" w:afterAutospacing="off"/>
+            </w:pPr>
+            <w:r>
+              <w:rPr/>
+              <w:t>Caja Blanca — McCabe</w:t>
+            </w:r>
+          </w:p>
+        </w:tc>
+      </w:tr>
+    </w:tbl>
+    <w:p>
+      <w:pPr>
+        <w:pStyle w:val="Normal"/>
+        <w:suppressLineNumbers w:val="0"/>
+        <w:bidi w:val="0"/>
+        <w:spacing w:before="240" w:beforeAutospacing="off" w:after="240" w:afterAutospacing="off" w:line="259" w:lineRule="auto"/>
+        <w:ind w:left="0" w:right="0"/>
+        <w:jc w:val="left"/>
+        <w:rPr>
+          <w:rFonts w:ascii="Calibri" w:hAnsi="Calibri" w:eastAsia="Calibri" w:cs="Calibri"/>
+          <w:noProof w:val="0"/>
+          <w:sz w:val="22"/>
+          <w:szCs w:val="22"/>
+          <w:lang w:val="es-ES"/>
+        </w:rPr>
+      </w:pPr>
+    </w:p>
+    <w:p>
+      <w:pPr>
+        <w:pStyle w:val="Ttulo3"/>
+        <w:bidi w:val="0"/>
+        <w:spacing w:before="281" w:beforeAutospacing="off" w:after="281" w:afterAutospacing="off"/>
+        <w:rPr>
+          <w:rFonts w:ascii="Calibri" w:hAnsi="Calibri" w:eastAsia="Calibri" w:cs="Calibri"/>
+          <w:b w:val="0"/>
+          <w:bCs w:val="0"/>
+          <w:noProof w:val="0"/>
+          <w:sz w:val="24"/>
+          <w:szCs w:val="24"/>
+          <w:lang w:val="es-ES"/>
+        </w:rPr>
+      </w:pPr>
+      <w:bookmarkStart w:name="_Toc1674748621" w:id="2019618995"/>
+      <w:r>
+        <w:rPr>
+          <w:rFonts w:ascii="Calibri" w:hAnsi="Calibri" w:eastAsia="Calibri" w:cs="Calibri"/>
+          <w:b w:val="0"/>
+          <w:bCs w:val="0"/>
+          <w:noProof w:val="0"/>
+          <w:sz w:val="24"/>
+          <w:szCs w:val="24"/>
+          <w:lang w:val="es-ES"/>
+        </w:rPr>
+        <w:t>Resumen por historia de usuario</w:t>
+      </w:r>
+      <w:bookmarkEnd w:id="2019618995"/>
+    </w:p>
+    <w:tbl>
+      <w:tblPr>
+        <w:tblStyle w:val="Tablaconcuadrcula"/>
         <w:bidiVisual w:val="0"/>
         <w:tblW w:w="0" w:type="auto"/>
         <w:tblLook w:val="06A0" w:firstRow="1" w:lastRow="0" w:firstColumn="1" w:lastColumn="0" w:noHBand="1" w:noVBand="1"/>
       </w:tblPr>
       <w:tblGrid>
-        <w:gridCol w:w="3732"/>
-        <w:gridCol w:w="3972"/>
+        <w:gridCol w:w="1245"/>
+        <w:gridCol w:w="1305"/>
+        <w:gridCol w:w="4545"/>
+        <w:gridCol w:w="1395"/>
       </w:tblGrid>
       <w:tr>
         <w:trPr>
@@ -24925,12 +25308,12 @@
         </w:trPr>
         <w:tc>
           <w:tcPr>
-            <w:tcW w:w="3732" w:type="dxa"/>
-            <w:tcMar/>
-            <w:vAlign w:val="center"/>
-          </w:tcPr>
-          <w:p>
-            <w:pPr>
+            <w:tcW w:w="1245" w:type="dxa"/>
+            <w:tcMar/>
+          </w:tcPr>
+          <w:p>
+            <w:pPr>
+              <w:bidi w:val="0"/>
               <w:spacing w:before="0" w:beforeAutospacing="off" w:after="0" w:afterAutospacing="off"/>
               <w:jc w:val="center"/>
             </w:pPr>
@@ -24939,18 +25322,58 @@
                 <w:b w:val="1"/>
                 <w:bCs w:val="1"/>
               </w:rPr>
-              <w:t>Métrica</w:t>
-            </w:r>
-          </w:p>
-        </w:tc>
-        <w:tc>
-          <w:tcPr>
-            <w:tcW w:w="3972" w:type="dxa"/>
-            <w:tcMar/>
-            <w:vAlign w:val="center"/>
-          </w:tcPr>
-          <w:p>
-            <w:pPr>
+              <w:t>Prueba</w:t>
+            </w:r>
+          </w:p>
+        </w:tc>
+        <w:tc>
+          <w:tcPr>
+            <w:tcW w:w="1305" w:type="dxa"/>
+            <w:tcMar/>
+          </w:tcPr>
+          <w:p>
+            <w:pPr>
+              <w:bidi w:val="0"/>
+              <w:spacing w:before="0" w:beforeAutospacing="off" w:after="0" w:afterAutospacing="off"/>
+              <w:jc w:val="center"/>
+            </w:pPr>
+            <w:r>
+              <w:rPr>
+                <w:b w:val="1"/>
+                <w:bCs w:val="1"/>
+              </w:rPr>
+              <w:t>Historia</w:t>
+            </w:r>
+          </w:p>
+        </w:tc>
+        <w:tc>
+          <w:tcPr>
+            <w:tcW w:w="4545" w:type="dxa"/>
+            <w:tcMar/>
+          </w:tcPr>
+          <w:p>
+            <w:pPr>
+              <w:bidi w:val="0"/>
+              <w:spacing w:before="0" w:beforeAutospacing="off" w:after="0" w:afterAutospacing="off"/>
+              <w:jc w:val="center"/>
+            </w:pPr>
+            <w:r>
+              <w:rPr>
+                <w:b w:val="1"/>
+                <w:bCs w:val="1"/>
+              </w:rPr>
+              <w:t>Funcionalidad</w:t>
+            </w:r>
+          </w:p>
+        </w:tc>
+        <w:tc>
+          <w:tcPr>
+            <w:tcW w:w="1395" w:type="dxa"/>
+            <w:tcMar/>
+          </w:tcPr>
+          <w:p>
+            <w:pPr>
+              <w:bidi w:val="0"/>
               <w:spacing w:before="0" w:beforeAutospacing="off" w:after="0" w:afterAutospacing="off"/>
               <w:jc w:val="center"/>
             </w:pPr>
@@ -24970,33 +25393,65 @@
         </w:trPr>
         <w:tc>
           <w:tcPr>
-            <w:tcW w:w="3732" w:type="dxa"/>
-            <w:tcMar/>
-            <w:vAlign w:val="center"/>
-          </w:tcPr>
-          <w:p>
-            <w:pPr>
-              <w:spacing w:before="0" w:beforeAutospacing="off" w:after="0" w:afterAutospacing="off"/>
-            </w:pPr>
-            <w:r>
-              <w:rPr/>
-              <w:t>Historias de usuario planificadas</w:t>
-            </w:r>
-          </w:p>
-        </w:tc>
-        <w:tc>
-          <w:tcPr>
-            <w:tcW w:w="3972" w:type="dxa"/>
-            <w:tcMar/>
-            <w:vAlign w:val="center"/>
-          </w:tcPr>
-          <w:p>
-            <w:pPr>
-              <w:spacing w:before="0" w:beforeAutospacing="off" w:after="0" w:afterAutospacing="off"/>
-            </w:pPr>
-            <w:r>
-              <w:rPr/>
-              <w:t>5</w:t>
+            <w:tcW w:w="1245" w:type="dxa"/>
+            <w:tcMar/>
+          </w:tcPr>
+          <w:p>
+            <w:pPr>
+              <w:bidi w:val="0"/>
+              <w:spacing w:before="0" w:beforeAutospacing="off" w:after="0" w:afterAutospacing="off"/>
+            </w:pPr>
+            <w:r>
+              <w:rPr/>
+              <w:t>Prueba 1</w:t>
+            </w:r>
+          </w:p>
+        </w:tc>
+        <w:tc>
+          <w:tcPr>
+            <w:tcW w:w="1305" w:type="dxa"/>
+            <w:tcMar/>
+          </w:tcPr>
+          <w:p>
+            <w:pPr>
+              <w:bidi w:val="0"/>
+              <w:spacing w:before="0" w:beforeAutospacing="off" w:after="0" w:afterAutospacing="off"/>
+            </w:pPr>
+            <w:r>
+              <w:rPr/>
+              <w:t>HU-01</w:t>
+            </w:r>
+          </w:p>
+        </w:tc>
+        <w:tc>
+          <w:tcPr>
+            <w:tcW w:w="4545" w:type="dxa"/>
+            <w:tcMar/>
+          </w:tcPr>
+          <w:p>
+            <w:pPr>
+              <w:bidi w:val="0"/>
+              <w:spacing w:before="0" w:beforeAutospacing="off" w:after="0" w:afterAutospacing="off"/>
+            </w:pPr>
+            <w:r>
+              <w:rPr/>
+              <w:t>Registro de máquina y localización</w:t>
+            </w:r>
+          </w:p>
+        </w:tc>
+        <w:tc>
+          <w:tcPr>
+            <w:tcW w:w="1395" w:type="dxa"/>
+            <w:tcMar/>
+          </w:tcPr>
+          <w:p>
+            <w:pPr>
+              <w:bidi w:val="0"/>
+              <w:spacing w:before="0" w:beforeAutospacing="off" w:after="0" w:afterAutospacing="off"/>
+            </w:pPr>
+            <w:r>
+              <w:rPr/>
+              <w:t>Superada</w:t>
             </w:r>
           </w:p>
         </w:tc>
@@ -25007,33 +25462,65 @@
         </w:trPr>
         <w:tc>
           <w:tcPr>
-            <w:tcW w:w="3732" w:type="dxa"/>
-            <w:tcMar/>
-            <w:vAlign w:val="center"/>
-          </w:tcPr>
-          <w:p>
-            <w:pPr>
-              <w:spacing w:before="0" w:beforeAutospacing="off" w:after="0" w:afterAutospacing="off"/>
-            </w:pPr>
-            <w:r>
-              <w:rPr/>
-              <w:t>Historias de usuario entregadas</w:t>
-            </w:r>
-          </w:p>
-        </w:tc>
-        <w:tc>
-          <w:tcPr>
-            <w:tcW w:w="3972" w:type="dxa"/>
-            <w:tcMar/>
-            <w:vAlign w:val="center"/>
-          </w:tcPr>
-          <w:p>
-            <w:pPr>
-              <w:spacing w:before="0" w:beforeAutospacing="off" w:after="0" w:afterAutospacing="off"/>
-            </w:pPr>
-            <w:r>
-              <w:rPr/>
-              <w:t>5</w:t>
+            <w:tcW w:w="1245" w:type="dxa"/>
+            <w:tcMar/>
+          </w:tcPr>
+          <w:p>
+            <w:pPr>
+              <w:bidi w:val="0"/>
+              <w:spacing w:before="0" w:beforeAutospacing="off" w:after="0" w:afterAutospacing="off"/>
+            </w:pPr>
+            <w:r>
+              <w:rPr/>
+              <w:t>Prueba 2</w:t>
+            </w:r>
+          </w:p>
+        </w:tc>
+        <w:tc>
+          <w:tcPr>
+            <w:tcW w:w="1305" w:type="dxa"/>
+            <w:tcMar/>
+          </w:tcPr>
+          <w:p>
+            <w:pPr>
+              <w:bidi w:val="0"/>
+              <w:spacing w:before="0" w:beforeAutospacing="off" w:after="0" w:afterAutospacing="off"/>
+            </w:pPr>
+            <w:r>
+              <w:rPr/>
+              <w:t>HU-02</w:t>
+            </w:r>
+          </w:p>
+        </w:tc>
+        <w:tc>
+          <w:tcPr>
+            <w:tcW w:w="4545" w:type="dxa"/>
+            <w:tcMar/>
+          </w:tcPr>
+          <w:p>
+            <w:pPr>
+              <w:bidi w:val="0"/>
+              <w:spacing w:before="0" w:beforeAutospacing="off" w:after="0" w:afterAutospacing="off"/>
+            </w:pPr>
+            <w:r>
+              <w:rPr/>
+              <w:t>Registro de productos y modificación de precio</w:t>
+            </w:r>
+          </w:p>
+        </w:tc>
+        <w:tc>
+          <w:tcPr>
+            <w:tcW w:w="1395" w:type="dxa"/>
+            <w:tcMar/>
+          </w:tcPr>
+          <w:p>
+            <w:pPr>
+              <w:bidi w:val="0"/>
+              <w:spacing w:before="0" w:beforeAutospacing="off" w:after="0" w:afterAutospacing="off"/>
+            </w:pPr>
+            <w:r>
+              <w:rPr/>
+              <w:t>Superada</w:t>
             </w:r>
           </w:p>
         </w:tc>
@@ -25044,33 +25531,65 @@
         </w:trPr>
         <w:tc>
           <w:tcPr>
-            <w:tcW w:w="3732" w:type="dxa"/>
-            <w:tcMar/>
-            <w:vAlign w:val="center"/>
-          </w:tcPr>
-          <w:p>
-            <w:pPr>
-              <w:spacing w:before="0" w:beforeAutospacing="off" w:after="0" w:afterAutospacing="off"/>
-            </w:pPr>
-            <w:r>
-              <w:rPr/>
-              <w:t>Porcentaje de historias completadas</w:t>
-            </w:r>
-          </w:p>
-        </w:tc>
-        <w:tc>
-          <w:tcPr>
-            <w:tcW w:w="3972" w:type="dxa"/>
-            <w:tcMar/>
-            <w:vAlign w:val="center"/>
-          </w:tcPr>
-          <w:p>
-            <w:pPr>
-              <w:spacing w:before="0" w:beforeAutospacing="off" w:after="0" w:afterAutospacing="off"/>
-            </w:pPr>
-            <w:r>
-              <w:rPr/>
-              <w:t>100%</w:t>
+            <w:tcW w:w="1245" w:type="dxa"/>
+            <w:tcMar/>
+          </w:tcPr>
+          <w:p>
+            <w:pPr>
+              <w:bidi w:val="0"/>
+              <w:spacing w:before="0" w:beforeAutospacing="off" w:after="0" w:afterAutospacing="off"/>
+            </w:pPr>
+            <w:r>
+              <w:rPr/>
+              <w:t>Prueba 3</w:t>
+            </w:r>
+          </w:p>
+        </w:tc>
+        <w:tc>
+          <w:tcPr>
+            <w:tcW w:w="1305" w:type="dxa"/>
+            <w:tcMar/>
+          </w:tcPr>
+          <w:p>
+            <w:pPr>
+              <w:bidi w:val="0"/>
+              <w:spacing w:before="0" w:beforeAutospacing="off" w:after="0" w:afterAutospacing="off"/>
+            </w:pPr>
+            <w:r>
+              <w:rPr/>
+              <w:t>HU-03</w:t>
+            </w:r>
+          </w:p>
+        </w:tc>
+        <w:tc>
+          <w:tcPr>
+            <w:tcW w:w="4545" w:type="dxa"/>
+            <w:tcMar/>
+          </w:tcPr>
+          <w:p>
+            <w:pPr>
+              <w:bidi w:val="0"/>
+              <w:spacing w:before="0" w:beforeAutospacing="off" w:after="0" w:afterAutospacing="off"/>
+            </w:pPr>
+            <w:r>
+              <w:rPr/>
+              <w:t>Consulta de inventario de una máquina</w:t>
+            </w:r>
+          </w:p>
+        </w:tc>
+        <w:tc>
+          <w:tcPr>
+            <w:tcW w:w="1395" w:type="dxa"/>
+            <w:tcMar/>
+          </w:tcPr>
+          <w:p>
+            <w:pPr>
+              <w:bidi w:val="0"/>
+              <w:spacing w:before="0" w:beforeAutospacing="off" w:after="0" w:afterAutospacing="off"/>
+            </w:pPr>
+            <w:r>
+              <w:rPr/>
+              <w:t>Superada</w:t>
             </w:r>
           </w:p>
         </w:tc>
@@ -25081,33 +25600,65 @@
         </w:trPr>
         <w:tc>
           <w:tcPr>
-            <w:tcW w:w="3732" w:type="dxa"/>
-            <w:tcMar/>
-            <w:vAlign w:val="center"/>
-          </w:tcPr>
-          <w:p>
-            <w:pPr>
-              <w:spacing w:before="0" w:beforeAutospacing="off" w:after="0" w:afterAutospacing="off"/>
-            </w:pPr>
-            <w:r>
-              <w:rPr/>
-              <w:t>Fallos funcionales abiertos al cierre</w:t>
-            </w:r>
-          </w:p>
-        </w:tc>
-        <w:tc>
-          <w:tcPr>
-            <w:tcW w:w="3972" w:type="dxa"/>
-            <w:tcMar/>
-            <w:vAlign w:val="center"/>
-          </w:tcPr>
-          <w:p>
-            <w:pPr>
-              <w:spacing w:before="0" w:beforeAutospacing="off" w:after="0" w:afterAutospacing="off"/>
-            </w:pPr>
-            <w:r>
-              <w:rPr/>
-              <w:t>0</w:t>
+            <w:tcW w:w="1245" w:type="dxa"/>
+            <w:tcMar/>
+          </w:tcPr>
+          <w:p>
+            <w:pPr>
+              <w:bidi w:val="0"/>
+              <w:spacing w:before="0" w:beforeAutospacing="off" w:after="0" w:afterAutospacing="off"/>
+            </w:pPr>
+            <w:r>
+              <w:rPr/>
+              <w:t>Prueba 4</w:t>
+            </w:r>
+          </w:p>
+        </w:tc>
+        <w:tc>
+          <w:tcPr>
+            <w:tcW w:w="1305" w:type="dxa"/>
+            <w:tcMar/>
+          </w:tcPr>
+          <w:p>
+            <w:pPr>
+              <w:bidi w:val="0"/>
+              <w:spacing w:before="0" w:beforeAutospacing="off" w:after="0" w:afterAutospacing="off"/>
+            </w:pPr>
+            <w:r>
+              <w:rPr/>
+              <w:t>HU-04</w:t>
+            </w:r>
+          </w:p>
+        </w:tc>
+        <w:tc>
+          <w:tcPr>
+            <w:tcW w:w="4545" w:type="dxa"/>
+            <w:tcMar/>
+          </w:tcPr>
+          <w:p>
+            <w:pPr>
+              <w:bidi w:val="0"/>
+              <w:spacing w:before="0" w:beforeAutospacing="off" w:after="0" w:afterAutospacing="off"/>
+            </w:pPr>
+            <w:r>
+              <w:rPr/>
+              <w:t>Actualización de stock tras venta simulada</w:t>
+            </w:r>
+          </w:p>
+        </w:tc>
+        <w:tc>
+          <w:tcPr>
+            <w:tcW w:w="1395" w:type="dxa"/>
+            <w:tcMar/>
+          </w:tcPr>
+          <w:p>
+            <w:pPr>
+              <w:bidi w:val="0"/>
+              <w:spacing w:before="0" w:beforeAutospacing="off" w:after="0" w:afterAutospacing="off"/>
+            </w:pPr>
+            <w:r>
+              <w:rPr/>
+              <w:t>Superada</w:t>
             </w:r>
           </w:p>
         </w:tc>
@@ -25118,144 +25669,65 @@
         </w:trPr>
         <w:tc>
           <w:tcPr>
-            <w:tcW w:w="3732" w:type="dxa"/>
-            <w:tcMar/>
-            <w:vAlign w:val="center"/>
-          </w:tcPr>
-          <w:p>
-            <w:pPr>
-              <w:spacing w:before="0" w:beforeAutospacing="off" w:after="0" w:afterAutospacing="off"/>
-            </w:pPr>
-            <w:r>
-              <w:rPr/>
-              <w:t>Nivel principal de prueba</w:t>
-            </w:r>
-          </w:p>
-        </w:tc>
-        <w:tc>
-          <w:tcPr>
-            <w:tcW w:w="3972" w:type="dxa"/>
-            <w:tcMar/>
-            <w:vAlign w:val="center"/>
-          </w:tcPr>
-          <w:p>
-            <w:pPr>
-              <w:spacing w:before="0" w:beforeAutospacing="off" w:after="0" w:afterAutospacing="off"/>
-            </w:pPr>
-            <w:r>
-              <w:rPr/>
-              <w:t>Unidad</w:t>
-            </w:r>
-          </w:p>
-        </w:tc>
-      </w:tr>
-      <w:tr>
-        <w:trPr>
-          <w:trHeight w:val="300"/>
-        </w:trPr>
-        <w:tc>
-          <w:tcPr>
-            <w:tcW w:w="3732" w:type="dxa"/>
-            <w:tcMar/>
-            <w:vAlign w:val="center"/>
-          </w:tcPr>
-          <w:p>
-            <w:pPr>
-              <w:spacing w:before="0" w:beforeAutospacing="off" w:after="0" w:afterAutospacing="off"/>
-            </w:pPr>
-            <w:r>
-              <w:rPr/>
-              <w:t>Pruebas de integración aplicadas</w:t>
-            </w:r>
-          </w:p>
-        </w:tc>
-        <w:tc>
-          <w:tcPr>
-            <w:tcW w:w="3972" w:type="dxa"/>
-            <w:tcMar/>
-            <w:vAlign w:val="center"/>
-          </w:tcPr>
-          <w:p>
-            <w:pPr>
-              <w:spacing w:before="0" w:beforeAutospacing="off" w:after="0" w:afterAutospacing="off"/>
-            </w:pPr>
-            <w:r>
-              <w:rPr/>
-              <w:t>Sí, en DAOs con clases colaboradoras</w:t>
-            </w:r>
-          </w:p>
-        </w:tc>
-      </w:tr>
-      <w:tr>
-        <w:trPr>
-          <w:trHeight w:val="300"/>
-        </w:trPr>
-        <w:tc>
-          <w:tcPr>
-            <w:tcW w:w="3732" w:type="dxa"/>
-            <w:tcMar/>
-            <w:vAlign w:val="center"/>
-          </w:tcPr>
-          <w:p>
-            <w:pPr>
-              <w:spacing w:before="0" w:beforeAutospacing="off" w:after="0" w:afterAutospacing="off"/>
-            </w:pPr>
-            <w:r>
-              <w:rPr/>
-              <w:t>Técnica principal</w:t>
-            </w:r>
-          </w:p>
-        </w:tc>
-        <w:tc>
-          <w:tcPr>
-            <w:tcW w:w="3972" w:type="dxa"/>
-            <w:tcMar/>
-            <w:vAlign w:val="center"/>
-          </w:tcPr>
-          <w:p>
-            <w:pPr>
-              <w:spacing w:before="0" w:beforeAutospacing="off" w:after="0" w:afterAutospacing="off"/>
-            </w:pPr>
-            <w:r>
-              <w:rPr/>
-              <w:t>Caja Negra — Clases de Equivalencia</w:t>
-            </w:r>
-          </w:p>
-        </w:tc>
-      </w:tr>
-      <w:tr>
-        <w:trPr>
-          <w:trHeight w:val="300"/>
-        </w:trPr>
-        <w:tc>
-          <w:tcPr>
-            <w:tcW w:w="3732" w:type="dxa"/>
-            <w:tcMar/>
-            <w:vAlign w:val="center"/>
-          </w:tcPr>
-          <w:p>
-            <w:pPr>
-              <w:spacing w:before="0" w:beforeAutospacing="off" w:after="0" w:afterAutospacing="off"/>
-            </w:pPr>
-            <w:r>
-              <w:rPr/>
-              <w:t>Técnica complementaria</w:t>
-            </w:r>
-          </w:p>
-        </w:tc>
-        <w:tc>
-          <w:tcPr>
-            <w:tcW w:w="3972" w:type="dxa"/>
-            <w:tcMar/>
-            <w:vAlign w:val="center"/>
-          </w:tcPr>
-          <w:p>
-            <w:pPr>
-              <w:spacing w:before="0" w:beforeAutospacing="off" w:after="0" w:afterAutospacing="off"/>
-            </w:pPr>
-            <w:r>
-              <w:rPr/>
-              <w:t>Caja Blanca — McCabe</w:t>
+            <w:tcW w:w="1245" w:type="dxa"/>
+            <w:tcMar/>
+          </w:tcPr>
+          <w:p>
+            <w:pPr>
+              <w:bidi w:val="0"/>
+              <w:spacing w:before="0" w:beforeAutospacing="off" w:after="0" w:afterAutospacing="off"/>
+            </w:pPr>
+            <w:r>
+              <w:rPr/>
+              <w:t>Prueba 5</w:t>
+            </w:r>
+          </w:p>
+        </w:tc>
+        <w:tc>
+          <w:tcPr>
+            <w:tcW w:w="1305" w:type="dxa"/>
+            <w:tcMar/>
+          </w:tcPr>
+          <w:p>
+            <w:pPr>
+              <w:bidi w:val="0"/>
+              <w:spacing w:before="0" w:beforeAutospacing="off" w:after="0" w:afterAutospacing="off"/>
+            </w:pPr>
+            <w:r>
+              <w:rPr/>
+              <w:t>HU-05</w:t>
+            </w:r>
+          </w:p>
+        </w:tc>
+        <w:tc>
+          <w:tcPr>
+            <w:tcW w:w="4545" w:type="dxa"/>
+            <w:tcMar/>
+          </w:tcPr>
+          <w:p>
+            <w:pPr>
+              <w:bidi w:val="0"/>
+              <w:spacing w:before="0" w:beforeAutospacing="off" w:after="0" w:afterAutospacing="off"/>
+            </w:pPr>
+            <w:r>
+              <w:rPr/>
+              <w:t>Identificación de productos para reposición</w:t>
+            </w:r>
+          </w:p>
+        </w:tc>
+        <w:tc>
+          <w:tcPr>
+            <w:tcW w:w="1395" w:type="dxa"/>
+            <w:tcMar/>
+          </w:tcPr>
+          <w:p>
+            <w:pPr>
+              <w:bidi w:val="0"/>
+              <w:spacing w:before="0" w:beforeAutospacing="off" w:after="0" w:afterAutospacing="off"/>
+            </w:pPr>
+            <w:r>
+              <w:rPr/>
+              <w:t>Superada</w:t>
             </w:r>
           </w:p>
         </w:tc>
@@ -25263,502 +25735,18 @@
     </w:tbl>
     <w:p>
       <w:pPr>
-        <w:pStyle w:val="Ttulo3"/>
+        <w:pStyle w:val="Normal"/>
+        <w:suppressLineNumbers w:val="0"/>
         <w:bidi w:val="0"/>
-        <w:spacing w:before="281" w:beforeAutospacing="off" w:after="281" w:afterAutospacing="off"/>
-        <w:rPr>
-          <w:rFonts w:ascii="Calibri" w:hAnsi="Calibri" w:eastAsia="Calibri" w:cs="Calibri"/>
-          <w:b w:val="0"/>
-          <w:bCs w:val="0"/>
-          <w:noProof w:val="0"/>
-          <w:sz w:val="24"/>
-          <w:szCs w:val="24"/>
-          <w:lang w:val="es-ES"/>
-        </w:rPr>
-      </w:pPr>
-      <w:bookmarkStart w:name="_Toc1674748621" w:id="2019618995"/>
-      <w:r>
-        <w:rPr>
-          <w:rFonts w:ascii="Calibri" w:hAnsi="Calibri" w:eastAsia="Calibri" w:cs="Calibri"/>
-          <w:b w:val="0"/>
-          <w:bCs w:val="0"/>
-          <w:noProof w:val="0"/>
-          <w:sz w:val="24"/>
-          <w:szCs w:val="24"/>
-          <w:lang w:val="es-ES"/>
-        </w:rPr>
-        <w:t>Resumen por historia de usuario</w:t>
-      </w:r>
-      <w:bookmarkEnd w:id="2019618995"/>
-    </w:p>
-    <w:tbl>
-      <w:tblPr>
-        <w:tblStyle w:val="Tablanormal"/>
-        <w:bidiVisual w:val="0"/>
-        <w:tblW w:w="0" w:type="auto"/>
-        <w:tblLook w:val="06A0" w:firstRow="1" w:lastRow="0" w:firstColumn="1" w:lastColumn="0" w:noHBand="1" w:noVBand="1"/>
-      </w:tblPr>
-      <w:tblGrid>
-        <w:gridCol w:w="1147"/>
-        <w:gridCol w:w="1140"/>
-        <w:gridCol w:w="4859"/>
-        <w:gridCol w:w="1327"/>
-      </w:tblGrid>
-      <w:tr>
-        <w:trPr>
-          <w:trHeight w:val="300"/>
-        </w:trPr>
-        <w:tc>
-          <w:tcPr>
-            <w:tcW w:w="1147" w:type="dxa"/>
-            <w:tcMar/>
-            <w:vAlign w:val="center"/>
-          </w:tcPr>
-          <w:p>
-            <w:pPr>
-              <w:bidi w:val="0"/>
-              <w:spacing w:before="0" w:beforeAutospacing="off" w:after="0" w:afterAutospacing="off"/>
-              <w:jc w:val="center"/>
-            </w:pPr>
-            <w:r>
-              <w:rPr>
-                <w:b w:val="1"/>
-                <w:bCs w:val="1"/>
-              </w:rPr>
-              <w:t>Prueba</w:t>
-            </w:r>
-          </w:p>
-        </w:tc>
-        <w:tc>
-          <w:tcPr>
-            <w:tcW w:w="1140" w:type="dxa"/>
-            <w:tcMar/>
-            <w:vAlign w:val="center"/>
-          </w:tcPr>
-          <w:p>
-            <w:pPr>
-              <w:bidi w:val="0"/>
-              <w:spacing w:before="0" w:beforeAutospacing="off" w:after="0" w:afterAutospacing="off"/>
-              <w:jc w:val="center"/>
-            </w:pPr>
-            <w:r>
-              <w:rPr>
-                <w:b w:val="1"/>
-                <w:bCs w:val="1"/>
-              </w:rPr>
-              <w:t>Historia</w:t>
-            </w:r>
-          </w:p>
-        </w:tc>
-        <w:tc>
-          <w:tcPr>
-            <w:tcW w:w="4859" w:type="dxa"/>
-            <w:tcMar/>
-            <w:vAlign w:val="center"/>
-          </w:tcPr>
-          <w:p>
-            <w:pPr>
-              <w:bidi w:val="0"/>
-              <w:spacing w:before="0" w:beforeAutospacing="off" w:after="0" w:afterAutospacing="off"/>
-              <w:jc w:val="center"/>
-            </w:pPr>
-            <w:r>
-              <w:rPr>
-                <w:b w:val="1"/>
-                <w:bCs w:val="1"/>
-              </w:rPr>
-              <w:t>Funcionalidad</w:t>
-            </w:r>
-          </w:p>
-        </w:tc>
-        <w:tc>
-          <w:tcPr>
-            <w:tcW w:w="1327" w:type="dxa"/>
-            <w:tcMar/>
-            <w:vAlign w:val="center"/>
-          </w:tcPr>
-          <w:p>
-            <w:pPr>
-              <w:bidi w:val="0"/>
-              <w:spacing w:before="0" w:beforeAutospacing="off" w:after="0" w:afterAutospacing="off"/>
-              <w:jc w:val="center"/>
-            </w:pPr>
-            <w:r>
-              <w:rPr>
-                <w:b w:val="1"/>
-                <w:bCs w:val="1"/>
-              </w:rPr>
-              <w:t>Resultado</w:t>
-            </w:r>
-          </w:p>
-        </w:tc>
-      </w:tr>
-      <w:tr>
-        <w:trPr>
-          <w:trHeight w:val="300"/>
-        </w:trPr>
-        <w:tc>
-          <w:tcPr>
-            <w:tcW w:w="1147" w:type="dxa"/>
-            <w:tcMar/>
-            <w:vAlign w:val="center"/>
-          </w:tcPr>
-          <w:p>
-            <w:pPr>
-              <w:bidi w:val="0"/>
-              <w:spacing w:before="0" w:beforeAutospacing="off" w:after="0" w:afterAutospacing="off"/>
-            </w:pPr>
-            <w:r>
-              <w:rPr/>
-              <w:t>Prueba 1</w:t>
-            </w:r>
-          </w:p>
-        </w:tc>
-        <w:tc>
-          <w:tcPr>
-            <w:tcW w:w="1140" w:type="dxa"/>
-            <w:tcMar/>
-            <w:vAlign w:val="center"/>
-          </w:tcPr>
-          <w:p>
-            <w:pPr>
-              <w:bidi w:val="0"/>
-              <w:spacing w:before="0" w:beforeAutospacing="off" w:after="0" w:afterAutospacing="off"/>
-            </w:pPr>
-            <w:r>
-              <w:rPr/>
-              <w:t>HU-01</w:t>
-            </w:r>
-          </w:p>
-        </w:tc>
-        <w:tc>
-          <w:tcPr>
-            <w:tcW w:w="4859" w:type="dxa"/>
-            <w:tcMar/>
-            <w:vAlign w:val="center"/>
-          </w:tcPr>
-          <w:p>
-            <w:pPr>
-              <w:bidi w:val="0"/>
-              <w:spacing w:before="0" w:beforeAutospacing="off" w:after="0" w:afterAutospacing="off"/>
-            </w:pPr>
-            <w:r>
-              <w:rPr/>
-              <w:t>Registro de máquina y localización</w:t>
-            </w:r>
-          </w:p>
-        </w:tc>
-        <w:tc>
-          <w:tcPr>
-            <w:tcW w:w="1327" w:type="dxa"/>
-            <w:tcMar/>
-            <w:vAlign w:val="center"/>
-          </w:tcPr>
-          <w:p>
-            <w:pPr>
-              <w:bidi w:val="0"/>
-              <w:spacing w:before="0" w:beforeAutospacing="off" w:after="0" w:afterAutospacing="off"/>
-            </w:pPr>
-            <w:r>
-              <w:rPr/>
-              <w:t>Superada</w:t>
-            </w:r>
-          </w:p>
-        </w:tc>
-      </w:tr>
-      <w:tr>
-        <w:trPr>
-          <w:trHeight w:val="300"/>
-        </w:trPr>
-        <w:tc>
-          <w:tcPr>
-            <w:tcW w:w="1147" w:type="dxa"/>
-            <w:tcMar/>
-            <w:vAlign w:val="center"/>
-          </w:tcPr>
-          <w:p>
-            <w:pPr>
-              <w:bidi w:val="0"/>
-              <w:spacing w:before="0" w:beforeAutospacing="off" w:after="0" w:afterAutospacing="off"/>
-            </w:pPr>
-            <w:r>
-              <w:rPr/>
-              <w:t>Prueba 2</w:t>
-            </w:r>
-          </w:p>
-        </w:tc>
-        <w:tc>
-          <w:tcPr>
-            <w:tcW w:w="1140" w:type="dxa"/>
-            <w:tcMar/>
-            <w:vAlign w:val="center"/>
-          </w:tcPr>
-          <w:p>
-            <w:pPr>
-              <w:bidi w:val="0"/>
-              <w:spacing w:before="0" w:beforeAutospacing="off" w:after="0" w:afterAutospacing="off"/>
-            </w:pPr>
-            <w:r>
-              <w:rPr/>
-              <w:t>HU-02</w:t>
-            </w:r>
-          </w:p>
-        </w:tc>
-        <w:tc>
-          <w:tcPr>
-            <w:tcW w:w="4859" w:type="dxa"/>
-            <w:tcMar/>
-            <w:vAlign w:val="center"/>
-          </w:tcPr>
-          <w:p>
-            <w:pPr>
-              <w:bidi w:val="0"/>
-              <w:spacing w:before="0" w:beforeAutospacing="off" w:after="0" w:afterAutospacing="off"/>
-            </w:pPr>
-            <w:r>
-              <w:rPr/>
-              <w:t>Registro de productos y modificación de precio</w:t>
-            </w:r>
-          </w:p>
-        </w:tc>
-        <w:tc>
-          <w:tcPr>
-            <w:tcW w:w="1327" w:type="dxa"/>
-            <w:tcMar/>
-            <w:vAlign w:val="center"/>
-          </w:tcPr>
-          <w:p>
-            <w:pPr>
-              <w:bidi w:val="0"/>
-              <w:spacing w:before="0" w:beforeAutospacing="off" w:after="0" w:afterAutospacing="off"/>
-            </w:pPr>
-            <w:r>
-              <w:rPr/>
-              <w:t>Superada</w:t>
-            </w:r>
-          </w:p>
-        </w:tc>
-      </w:tr>
-      <w:tr>
-        <w:trPr>
-          <w:trHeight w:val="300"/>
-        </w:trPr>
-        <w:tc>
-          <w:tcPr>
-            <w:tcW w:w="1147" w:type="dxa"/>
-            <w:tcMar/>
-            <w:vAlign w:val="center"/>
-          </w:tcPr>
-          <w:p>
-            <w:pPr>
-              <w:bidi w:val="0"/>
-              <w:spacing w:before="0" w:beforeAutospacing="off" w:after="0" w:afterAutospacing="off"/>
-            </w:pPr>
-            <w:r>
-              <w:rPr/>
-              <w:t>Prueba 3</w:t>
-            </w:r>
-          </w:p>
-        </w:tc>
-        <w:tc>
-          <w:tcPr>
-            <w:tcW w:w="1140" w:type="dxa"/>
-            <w:tcMar/>
-            <w:vAlign w:val="center"/>
-          </w:tcPr>
-          <w:p>
-            <w:pPr>
-              <w:bidi w:val="0"/>
-              <w:spacing w:before="0" w:beforeAutospacing="off" w:after="0" w:afterAutospacing="off"/>
-            </w:pPr>
-            <w:r>
-              <w:rPr/>
-              <w:t>HU-03</w:t>
-            </w:r>
-          </w:p>
-        </w:tc>
-        <w:tc>
-          <w:tcPr>
-            <w:tcW w:w="4859" w:type="dxa"/>
-            <w:tcMar/>
-            <w:vAlign w:val="center"/>
-          </w:tcPr>
-          <w:p>
-            <w:pPr>
-              <w:bidi w:val="0"/>
-              <w:spacing w:before="0" w:beforeAutospacing="off" w:after="0" w:afterAutospacing="off"/>
-            </w:pPr>
-            <w:r>
-              <w:rPr/>
-              <w:t>Consulta de inventario de una máquina</w:t>
-            </w:r>
-          </w:p>
-        </w:tc>
-        <w:tc>
-          <w:tcPr>
-            <w:tcW w:w="1327" w:type="dxa"/>
-            <w:tcMar/>
-            <w:vAlign w:val="center"/>
-          </w:tcPr>
-          <w:p>
-            <w:pPr>
-              <w:bidi w:val="0"/>
-              <w:spacing w:before="0" w:beforeAutospacing="off" w:after="0" w:afterAutospacing="off"/>
-            </w:pPr>
-            <w:r>
-              <w:rPr/>
-              <w:t>Superada</w:t>
-            </w:r>
-          </w:p>
-        </w:tc>
-      </w:tr>
-      <w:tr>
-        <w:trPr>
-          <w:trHeight w:val="300"/>
-        </w:trPr>
-        <w:tc>
-          <w:tcPr>
-            <w:tcW w:w="1147" w:type="dxa"/>
-            <w:tcMar/>
-            <w:vAlign w:val="center"/>
-          </w:tcPr>
-          <w:p>
-            <w:pPr>
-              <w:bidi w:val="0"/>
-              <w:spacing w:before="0" w:beforeAutospacing="off" w:after="0" w:afterAutospacing="off"/>
-            </w:pPr>
-            <w:r>
-              <w:rPr/>
-              <w:t>Prueba 4</w:t>
-            </w:r>
-          </w:p>
-        </w:tc>
-        <w:tc>
-          <w:tcPr>
-            <w:tcW w:w="1140" w:type="dxa"/>
-            <w:tcMar/>
-            <w:vAlign w:val="center"/>
-          </w:tcPr>
-          <w:p>
-            <w:pPr>
-              <w:bidi w:val="0"/>
-              <w:spacing w:before="0" w:beforeAutospacing="off" w:after="0" w:afterAutospacing="off"/>
-            </w:pPr>
-            <w:r>
-              <w:rPr/>
-              <w:t>HU-04</w:t>
-            </w:r>
-          </w:p>
-        </w:tc>
-        <w:tc>
-          <w:tcPr>
-            <w:tcW w:w="4859" w:type="dxa"/>
-            <w:tcMar/>
-            <w:vAlign w:val="center"/>
-          </w:tcPr>
-          <w:p>
-            <w:pPr>
-              <w:bidi w:val="0"/>
-              <w:spacing w:before="0" w:beforeAutospacing="off" w:after="0" w:afterAutospacing="off"/>
-            </w:pPr>
-            <w:r>
-              <w:rPr/>
-              <w:t>Actualización de stock tras venta simulada</w:t>
-            </w:r>
-          </w:p>
-        </w:tc>
-        <w:tc>
-          <w:tcPr>
-            <w:tcW w:w="1327" w:type="dxa"/>
-            <w:tcMar/>
-            <w:vAlign w:val="center"/>
-          </w:tcPr>
-          <w:p>
-            <w:pPr>
-              <w:bidi w:val="0"/>
-              <w:spacing w:before="0" w:beforeAutospacing="off" w:after="0" w:afterAutospacing="off"/>
-            </w:pPr>
-            <w:r>
-              <w:rPr/>
-              <w:t>Superada</w:t>
-            </w:r>
-          </w:p>
-        </w:tc>
-      </w:tr>
-      <w:tr>
-        <w:trPr>
-          <w:trHeight w:val="300"/>
-        </w:trPr>
-        <w:tc>
-          <w:tcPr>
-            <w:tcW w:w="1147" w:type="dxa"/>
-            <w:tcMar/>
-            <w:vAlign w:val="center"/>
-          </w:tcPr>
-          <w:p>
-            <w:pPr>
-              <w:bidi w:val="0"/>
-              <w:spacing w:before="0" w:beforeAutospacing="off" w:after="0" w:afterAutospacing="off"/>
-            </w:pPr>
-            <w:r>
-              <w:rPr/>
-              <w:t>Prueba 5</w:t>
-            </w:r>
-          </w:p>
-        </w:tc>
-        <w:tc>
-          <w:tcPr>
-            <w:tcW w:w="1140" w:type="dxa"/>
-            <w:tcMar/>
-            <w:vAlign w:val="center"/>
-          </w:tcPr>
-          <w:p>
-            <w:pPr>
-              <w:bidi w:val="0"/>
-              <w:spacing w:before="0" w:beforeAutospacing="off" w:after="0" w:afterAutospacing="off"/>
-            </w:pPr>
-            <w:r>
-              <w:rPr/>
-              <w:t>HU-05</w:t>
-            </w:r>
-          </w:p>
-        </w:tc>
-        <w:tc>
-          <w:tcPr>
-            <w:tcW w:w="4859" w:type="dxa"/>
-            <w:tcMar/>
-            <w:vAlign w:val="center"/>
-          </w:tcPr>
-          <w:p>
-            <w:pPr>
-              <w:bidi w:val="0"/>
-              <w:spacing w:before="0" w:beforeAutospacing="off" w:after="0" w:afterAutospacing="off"/>
-            </w:pPr>
-            <w:r>
-              <w:rPr/>
-              <w:t>Identificación de productos para reposición</w:t>
-            </w:r>
-          </w:p>
-        </w:tc>
-        <w:tc>
-          <w:tcPr>
-            <w:tcW w:w="1327" w:type="dxa"/>
-            <w:tcMar/>
-            <w:vAlign w:val="center"/>
-          </w:tcPr>
-          <w:p>
-            <w:pPr>
-              <w:bidi w:val="0"/>
-              <w:spacing w:before="0" w:beforeAutospacing="off" w:after="0" w:afterAutospacing="off"/>
-            </w:pPr>
-            <w:r>
-              <w:rPr/>
-              <w:t>Superada</w:t>
-            </w:r>
-          </w:p>
-        </w:tc>
-      </w:tr>
-    </w:tbl>
+        <w:spacing w:before="0" w:beforeAutospacing="off" w:after="160" w:afterAutospacing="off" w:line="259" w:lineRule="auto"/>
+        <w:ind w:left="0" w:right="0"/>
+        <w:jc w:val="left"/>
+        <w:rPr>
+          <w:noProof w:val="0"/>
+          <w:lang w:val="es-ES"/>
+        </w:rPr>
+      </w:pPr>
+    </w:p>
     <w:p>
       <w:pPr>
         <w:pStyle w:val="Ttulo3"/>
@@ -25811,15 +25799,15 @@
     </w:p>
     <w:tbl>
       <w:tblPr>
-        <w:tblStyle w:val="Tablanormal"/>
+        <w:tblStyle w:val="Tablaconcuadrcula"/>
         <w:bidiVisual w:val="0"/>
         <w:tblW w:w="0" w:type="auto"/>
         <w:tblLook w:val="06A0" w:firstRow="1" w:lastRow="0" w:firstColumn="1" w:lastColumn="0" w:noHBand="1" w:noVBand="1"/>
       </w:tblPr>
       <w:tblGrid>
-        <w:gridCol w:w="2558"/>
-        <w:gridCol w:w="4392"/>
-        <w:gridCol w:w="2818"/>
+        <w:gridCol w:w="2670"/>
+        <w:gridCol w:w="3210"/>
+        <w:gridCol w:w="2610"/>
       </w:tblGrid>
       <w:tr>
         <w:trPr>
@@ -25827,9 +25815,8 @@
         </w:trPr>
         <w:tc>
           <w:tcPr>
-            <w:tcW w:w="2558" w:type="dxa"/>
-            <w:tcMar/>
-            <w:vAlign w:val="center"/>
+            <w:tcW w:w="2670" w:type="dxa"/>
+            <w:tcMar/>
           </w:tcPr>
           <w:p>
             <w:pPr>
@@ -25848,9 +25835,8 @@
         </w:tc>
         <w:tc>
           <w:tcPr>
-            <w:tcW w:w="4392" w:type="dxa"/>
-            <w:tcMar/>
-            <w:vAlign w:val="center"/>
+            <w:tcW w:w="3210" w:type="dxa"/>
+            <w:tcMar/>
           </w:tcPr>
           <w:p>
             <w:pPr>
@@ -25869,9 +25855,8 @@
         </w:tc>
         <w:tc>
           <w:tcPr>
-            <w:tcW w:w="2818" w:type="dxa"/>
-            <w:tcMar/>
-            <w:vAlign w:val="center"/>
+            <w:tcW w:w="2610" w:type="dxa"/>
+            <w:tcMar/>
           </w:tcPr>
           <w:p>
             <w:pPr>
@@ -25895,9 +25880,8 @@
         </w:trPr>
         <w:tc>
           <w:tcPr>
-            <w:tcW w:w="2558" w:type="dxa"/>
-            <w:tcMar/>
-            <w:vAlign w:val="center"/>
+            <w:tcW w:w="2670" w:type="dxa"/>
+            <w:tcMar/>
           </w:tcPr>
           <w:p>
             <w:pPr>
@@ -25912,9 +25896,8 @@
         </w:tc>
         <w:tc>
           <w:tcPr>
-            <w:tcW w:w="4392" w:type="dxa"/>
-            <w:tcMar/>
-            <w:vAlign w:val="center"/>
+            <w:tcW w:w="3210" w:type="dxa"/>
+            <w:tcMar/>
           </w:tcPr>
           <w:p>
             <w:pPr>
@@ -25929,9 +25912,8 @@
         </w:tc>
         <w:tc>
           <w:tcPr>
-            <w:tcW w:w="2818" w:type="dxa"/>
-            <w:tcMar/>
-            <w:vAlign w:val="center"/>
+            <w:tcW w:w="2610" w:type="dxa"/>
+            <w:tcMar/>
           </w:tcPr>
           <w:p>
             <w:pPr>
@@ -25951,9 +25933,8 @@
         </w:trPr>
         <w:tc>
           <w:tcPr>
-            <w:tcW w:w="2558" w:type="dxa"/>
-            <w:tcMar/>
-            <w:vAlign w:val="center"/>
+            <w:tcW w:w="2670" w:type="dxa"/>
+            <w:tcMar/>
           </w:tcPr>
           <w:p>
             <w:pPr>
@@ -25968,9 +25949,8 @@
         </w:tc>
         <w:tc>
           <w:tcPr>
-            <w:tcW w:w="4392" w:type="dxa"/>
-            <w:tcMar/>
-            <w:vAlign w:val="center"/>
+            <w:tcW w:w="3210" w:type="dxa"/>
+            <w:tcMar/>
           </w:tcPr>
           <w:p>
             <w:pPr>
@@ -25985,9 +25965,8 @@
         </w:tc>
         <w:tc>
           <w:tcPr>
-            <w:tcW w:w="2818" w:type="dxa"/>
-            <w:tcMar/>
-            <w:vAlign w:val="center"/>
+            <w:tcW w:w="2610" w:type="dxa"/>
+            <w:tcMar/>
           </w:tcPr>
           <w:p>
             <w:pPr>
@@ -26007,9 +25986,8 @@
         </w:trPr>
         <w:tc>
           <w:tcPr>
-            <w:tcW w:w="2558" w:type="dxa"/>
-            <w:tcMar/>
-            <w:vAlign w:val="center"/>
+            <w:tcW w:w="2670" w:type="dxa"/>
+            <w:tcMar/>
           </w:tcPr>
           <w:p>
             <w:pPr>
@@ -26024,9 +26002,8 @@
         </w:tc>
         <w:tc>
           <w:tcPr>
-            <w:tcW w:w="4392" w:type="dxa"/>
-            <w:tcMar/>
-            <w:vAlign w:val="center"/>
+            <w:tcW w:w="3210" w:type="dxa"/>
+            <w:tcMar/>
           </w:tcPr>
           <w:p>
             <w:pPr>
@@ -26041,9 +26018,8 @@
         </w:tc>
         <w:tc>
           <w:tcPr>
-            <w:tcW w:w="2818" w:type="dxa"/>
-            <w:tcMar/>
-            <w:vAlign w:val="center"/>
+            <w:tcW w:w="2610" w:type="dxa"/>
+            <w:tcMar/>
           </w:tcPr>
           <w:p>
             <w:pPr>
@@ -26063,9 +26039,8 @@
         </w:trPr>
         <w:tc>
           <w:tcPr>
-            <w:tcW w:w="2558" w:type="dxa"/>
-            <w:tcMar/>
-            <w:vAlign w:val="center"/>
+            <w:tcW w:w="2670" w:type="dxa"/>
+            <w:tcMar/>
           </w:tcPr>
           <w:p>
             <w:pPr>
@@ -26080,9 +26055,8 @@
         </w:tc>
         <w:tc>
           <w:tcPr>
-            <w:tcW w:w="4392" w:type="dxa"/>
-            <w:tcMar/>
-            <w:vAlign w:val="center"/>
+            <w:tcW w:w="3210" w:type="dxa"/>
+            <w:tcMar/>
           </w:tcPr>
           <w:p>
             <w:pPr>
@@ -26097,9 +26071,8 @@
         </w:tc>
         <w:tc>
           <w:tcPr>
-            <w:tcW w:w="2818" w:type="dxa"/>
-            <w:tcMar/>
-            <w:vAlign w:val="center"/>
+            <w:tcW w:w="2610" w:type="dxa"/>
+            <w:tcMar/>
           </w:tcPr>
           <w:p>
             <w:pPr>
@@ -26119,9 +26092,8 @@
         </w:trPr>
         <w:tc>
           <w:tcPr>
-            <w:tcW w:w="2558" w:type="dxa"/>
-            <w:tcMar/>
-            <w:vAlign w:val="center"/>
+            <w:tcW w:w="2670" w:type="dxa"/>
+            <w:tcMar/>
           </w:tcPr>
           <w:p>
             <w:pPr>
@@ -26136,9 +26108,8 @@
         </w:tc>
         <w:tc>
           <w:tcPr>
-            <w:tcW w:w="4392" w:type="dxa"/>
-            <w:tcMar/>
-            <w:vAlign w:val="center"/>
+            <w:tcW w:w="3210" w:type="dxa"/>
+            <w:tcMar/>
           </w:tcPr>
           <w:p>
             <w:pPr>
@@ -26153,9 +26124,8 @@
         </w:tc>
         <w:tc>
           <w:tcPr>
-            <w:tcW w:w="2818" w:type="dxa"/>
-            <w:tcMar/>
-            <w:vAlign w:val="center"/>
+            <w:tcW w:w="2610" w:type="dxa"/>
+            <w:tcMar/>
           </w:tcPr>
           <w:p>
             <w:pPr>
@@ -26175,9 +26145,8 @@
         </w:trPr>
         <w:tc>
           <w:tcPr>
-            <w:tcW w:w="2558" w:type="dxa"/>
-            <w:tcMar/>
-            <w:vAlign w:val="center"/>
+            <w:tcW w:w="2670" w:type="dxa"/>
+            <w:tcMar/>
           </w:tcPr>
           <w:p>
             <w:pPr>
@@ -26192,9 +26161,8 @@
         </w:tc>
         <w:tc>
           <w:tcPr>
-            <w:tcW w:w="4392" w:type="dxa"/>
-            <w:tcMar/>
-            <w:vAlign w:val="center"/>
+            <w:tcW w:w="3210" w:type="dxa"/>
+            <w:tcMar/>
           </w:tcPr>
           <w:p>
             <w:pPr>
@@ -26209,9 +26177,8 @@
         </w:tc>
         <w:tc>
           <w:tcPr>
-            <w:tcW w:w="2818" w:type="dxa"/>
-            <w:tcMar/>
-            <w:vAlign w:val="center"/>
+            <w:tcW w:w="2610" w:type="dxa"/>
+            <w:tcMar/>
           </w:tcPr>
           <w:p>
             <w:pPr>
@@ -26226,6 +26193,23 @@
         </w:tc>
       </w:tr>
     </w:tbl>
+    <w:p>
+      <w:pPr>
+        <w:pStyle w:val="Normal"/>
+        <w:suppressLineNumbers w:val="0"/>
+        <w:bidi w:val="0"/>
+        <w:spacing w:before="240" w:beforeAutospacing="off" w:after="240" w:afterAutospacing="off" w:line="259" w:lineRule="auto"/>
+        <w:ind w:left="0" w:right="0"/>
+        <w:jc w:val="left"/>
+        <w:rPr>
+          <w:rFonts w:ascii="Calibri" w:hAnsi="Calibri" w:eastAsia="Calibri" w:cs="Calibri"/>
+          <w:noProof w:val="0"/>
+          <w:sz w:val="22"/>
+          <w:szCs w:val="22"/>
+          <w:lang w:val="es-ES"/>
+        </w:rPr>
+      </w:pPr>
+    </w:p>
     <w:p>
       <w:pPr>
         <w:pStyle w:val="Ttulo3"/>
@@ -26278,15 +26262,15 @@
     </w:p>
     <w:tbl>
       <w:tblPr>
-        <w:tblStyle w:val="Tablanormal"/>
+        <w:tblStyle w:val="Tablaconcuadrcula"/>
         <w:bidiVisual w:val="0"/>
         <w:tblW w:w="0" w:type="auto"/>
         <w:tblLook w:val="06A0" w:firstRow="1" w:lastRow="0" w:firstColumn="1" w:lastColumn="0" w:noHBand="1" w:noVBand="1"/>
       </w:tblPr>
       <w:tblGrid>
-        <w:gridCol w:w="1959"/>
-        <w:gridCol w:w="3698"/>
-        <w:gridCol w:w="2833"/>
+        <w:gridCol w:w="2385"/>
+        <w:gridCol w:w="3465"/>
+        <w:gridCol w:w="2640"/>
       </w:tblGrid>
       <w:tr>
         <w:trPr>
@@ -26294,9 +26278,8 @@
         </w:trPr>
         <w:tc>
           <w:tcPr>
-            <w:tcW w:w="1959" w:type="dxa"/>
-            <w:tcMar/>
-            <w:vAlign w:val="center"/>
+            <w:tcW w:w="2385" w:type="dxa"/>
+            <w:tcMar/>
           </w:tcPr>
           <w:p>
             <w:pPr>
@@ -26315,9 +26298,8 @@
         </w:tc>
         <w:tc>
           <w:tcPr>
-            <w:tcW w:w="3698" w:type="dxa"/>
-            <w:tcMar/>
-            <w:vAlign w:val="center"/>
+            <w:tcW w:w="3465" w:type="dxa"/>
+            <w:tcMar/>
           </w:tcPr>
           <w:p>
             <w:pPr>
@@ -26336,9 +26318,8 @@
         </w:tc>
         <w:tc>
           <w:tcPr>
-            <w:tcW w:w="2833" w:type="dxa"/>
-            <w:tcMar/>
-            <w:vAlign w:val="center"/>
+            <w:tcW w:w="2640" w:type="dxa"/>
+            <w:tcMar/>
           </w:tcPr>
           <w:p>
             <w:pPr>
@@ -26362,9 +26343,8 @@
         </w:trPr>
         <w:tc>
           <w:tcPr>
-            <w:tcW w:w="1959" w:type="dxa"/>
-            <w:tcMar/>
-            <w:vAlign w:val="center"/>
+            <w:tcW w:w="2385" w:type="dxa"/>
+            <w:tcMar/>
           </w:tcPr>
           <w:p>
             <w:pPr>
@@ -26379,9 +26359,8 @@
         </w:tc>
         <w:tc>
           <w:tcPr>
-            <w:tcW w:w="3698" w:type="dxa"/>
-            <w:tcMar/>
-            <w:vAlign w:val="center"/>
+            <w:tcW w:w="3465" w:type="dxa"/>
+            <w:tcMar/>
           </w:tcPr>
           <w:p>
             <w:pPr>
@@ -26396,9 +26375,8 @@
         </w:tc>
         <w:tc>
           <w:tcPr>
-            <w:tcW w:w="2833" w:type="dxa"/>
-            <w:tcMar/>
-            <w:vAlign w:val="center"/>
+            <w:tcW w:w="2640" w:type="dxa"/>
+            <w:tcMar/>
           </w:tcPr>
           <w:p>
             <w:pPr>
@@ -26418,9 +26396,8 @@
         </w:trPr>
         <w:tc>
           <w:tcPr>
-            <w:tcW w:w="1959" w:type="dxa"/>
-            <w:tcMar/>
-            <w:vAlign w:val="center"/>
+            <w:tcW w:w="2385" w:type="dxa"/>
+            <w:tcMar/>
           </w:tcPr>
           <w:p>
             <w:pPr>
@@ -26435,9 +26412,8 @@
         </w:tc>
         <w:tc>
           <w:tcPr>
-            <w:tcW w:w="3698" w:type="dxa"/>
-            <w:tcMar/>
-            <w:vAlign w:val="center"/>
+            <w:tcW w:w="3465" w:type="dxa"/>
+            <w:tcMar/>
           </w:tcPr>
           <w:p>
             <w:pPr>
@@ -26452,9 +26428,8 @@
         </w:tc>
         <w:tc>
           <w:tcPr>
-            <w:tcW w:w="2833" w:type="dxa"/>
-            <w:tcMar/>
-            <w:vAlign w:val="center"/>
+            <w:tcW w:w="2640" w:type="dxa"/>
+            <w:tcMar/>
           </w:tcPr>
           <w:p>
             <w:pPr>
@@ -26474,9 +26449,8 @@
         </w:trPr>
         <w:tc>
           <w:tcPr>
-            <w:tcW w:w="1959" w:type="dxa"/>
-            <w:tcMar/>
-            <w:vAlign w:val="center"/>
+            <w:tcW w:w="2385" w:type="dxa"/>
+            <w:tcMar/>
           </w:tcPr>
           <w:p>
             <w:pPr>
@@ -26491,9 +26465,8 @@
         </w:tc>
         <w:tc>
           <w:tcPr>
-            <w:tcW w:w="3698" w:type="dxa"/>
-            <w:tcMar/>
-            <w:vAlign w:val="center"/>
+            <w:tcW w:w="3465" w:type="dxa"/>
+            <w:tcMar/>
           </w:tcPr>
           <w:p>
             <w:pPr>
@@ -26508,9 +26481,8 @@
         </w:tc>
         <w:tc>
           <w:tcPr>
-            <w:tcW w:w="2833" w:type="dxa"/>
-            <w:tcMar/>
-            <w:vAlign w:val="center"/>
+            <w:tcW w:w="2640" w:type="dxa"/>
+            <w:tcMar/>
           </w:tcPr>
           <w:p>
             <w:pPr>
@@ -26530,9 +26502,8 @@
         </w:trPr>
         <w:tc>
           <w:tcPr>
-            <w:tcW w:w="1959" w:type="dxa"/>
-            <w:tcMar/>
-            <w:vAlign w:val="center"/>
+            <w:tcW w:w="2385" w:type="dxa"/>
+            <w:tcMar/>
           </w:tcPr>
           <w:p>
             <w:pPr>
@@ -26547,9 +26518,8 @@
         </w:tc>
         <w:tc>
           <w:tcPr>
-            <w:tcW w:w="3698" w:type="dxa"/>
-            <w:tcMar/>
-            <w:vAlign w:val="center"/>
+            <w:tcW w:w="3465" w:type="dxa"/>
+            <w:tcMar/>
           </w:tcPr>
           <w:p>
             <w:pPr>
@@ -26564,9 +26534,8 @@
         </w:tc>
         <w:tc>
           <w:tcPr>
-            <w:tcW w:w="2833" w:type="dxa"/>
-            <w:tcMar/>
-            <w:vAlign w:val="center"/>
+            <w:tcW w:w="2640" w:type="dxa"/>
+            <w:tcMar/>
           </w:tcPr>
           <w:p>
             <w:pPr>
@@ -26586,9 +26555,8 @@
         </w:trPr>
         <w:tc>
           <w:tcPr>
-            <w:tcW w:w="1959" w:type="dxa"/>
-            <w:tcMar/>
-            <w:vAlign w:val="center"/>
+            <w:tcW w:w="2385" w:type="dxa"/>
+            <w:tcMar/>
           </w:tcPr>
           <w:p>
             <w:pPr>
@@ -26603,9 +26571,8 @@
         </w:tc>
         <w:tc>
           <w:tcPr>
-            <w:tcW w:w="3698" w:type="dxa"/>
-            <w:tcMar/>
-            <w:vAlign w:val="center"/>
+            <w:tcW w:w="3465" w:type="dxa"/>
+            <w:tcMar/>
           </w:tcPr>
           <w:p>
             <w:pPr>
@@ -26620,9 +26587,8 @@
         </w:tc>
         <w:tc>
           <w:tcPr>
-            <w:tcW w:w="2833" w:type="dxa"/>
-            <w:tcMar/>
-            <w:vAlign w:val="center"/>
+            <w:tcW w:w="2640" w:type="dxa"/>
+            <w:tcMar/>
           </w:tcPr>
           <w:p>
             <w:pPr>
@@ -26637,6 +26603,23 @@
         </w:tc>
       </w:tr>
     </w:tbl>
+    <w:p>
+      <w:pPr>
+        <w:pStyle w:val="Normal"/>
+        <w:suppressLineNumbers w:val="0"/>
+        <w:bidi w:val="0"/>
+        <w:spacing w:before="240" w:beforeAutospacing="off" w:after="240" w:afterAutospacing="off" w:line="259" w:lineRule="auto"/>
+        <w:ind w:left="0" w:right="0"/>
+        <w:jc w:val="left"/>
+        <w:rPr>
+          <w:rFonts w:ascii="Calibri" w:hAnsi="Calibri" w:eastAsia="Calibri" w:cs="Calibri"/>
+          <w:noProof w:val="0"/>
+          <w:sz w:val="22"/>
+          <w:szCs w:val="22"/>
+          <w:lang w:val="es-ES"/>
+        </w:rPr>
+      </w:pPr>
+    </w:p>
     <w:p>
       <w:pPr>
         <w:pStyle w:val="Ttulo3"/>
@@ -26689,14 +26672,14 @@
     </w:p>
     <w:tbl>
       <w:tblPr>
-        <w:tblStyle w:val="Tablanormal"/>
+        <w:tblStyle w:val="Tablaconcuadrcula"/>
         <w:bidiVisual w:val="0"/>
         <w:tblW w:w="0" w:type="auto"/>
         <w:tblLook w:val="06A0" w:firstRow="1" w:lastRow="0" w:firstColumn="1" w:lastColumn="0" w:noHBand="1" w:noVBand="1"/>
       </w:tblPr>
       <w:tblGrid>
-        <w:gridCol w:w="4386"/>
-        <w:gridCol w:w="2360"/>
+        <w:gridCol w:w="4740"/>
+        <w:gridCol w:w="3750"/>
       </w:tblGrid>
       <w:tr>
         <w:trPr>
@@ -26704,9 +26687,8 @@
         </w:trPr>
         <w:tc>
           <w:tcPr>
-            <w:tcW w:w="4386" w:type="dxa"/>
-            <w:tcMar/>
-            <w:vAlign w:val="center"/>
+            <w:tcW w:w="4740" w:type="dxa"/>
+            <w:tcMar/>
           </w:tcPr>
           <w:p>
             <w:pPr>
@@ -26725,9 +26707,8 @@
         </w:tc>
         <w:tc>
           <w:tcPr>
-            <w:tcW w:w="2360" w:type="dxa"/>
-            <w:tcMar/>
-            <w:vAlign w:val="center"/>
+            <w:tcW w:w="3750" w:type="dxa"/>
+            <w:tcMar/>
           </w:tcPr>
           <w:p>
             <w:pPr>
@@ -26751,9 +26732,8 @@
         </w:trPr>
         <w:tc>
           <w:tcPr>
-            <w:tcW w:w="4386" w:type="dxa"/>
-            <w:tcMar/>
-            <w:vAlign w:val="center"/>
+            <w:tcW w:w="4740" w:type="dxa"/>
+            <w:tcMar/>
           </w:tcPr>
           <w:p>
             <w:pPr>
@@ -26768,9 +26748,8 @@
         </w:tc>
         <w:tc>
           <w:tcPr>
-            <w:tcW w:w="2360" w:type="dxa"/>
-            <w:tcMar/>
-            <w:vAlign w:val="center"/>
+            <w:tcW w:w="3750" w:type="dxa"/>
+            <w:tcMar/>
           </w:tcPr>
           <w:p>
             <w:pPr>
@@ -26790,9 +26769,8 @@
         </w:trPr>
         <w:tc>
           <w:tcPr>
-            <w:tcW w:w="4386" w:type="dxa"/>
-            <w:tcMar/>
-            <w:vAlign w:val="center"/>
+            <w:tcW w:w="4740" w:type="dxa"/>
+            <w:tcMar/>
           </w:tcPr>
           <w:p>
             <w:pPr>
@@ -26807,9 +26785,8 @@
         </w:tc>
         <w:tc>
           <w:tcPr>
-            <w:tcW w:w="2360" w:type="dxa"/>
-            <w:tcMar/>
-            <w:vAlign w:val="center"/>
+            <w:tcW w:w="3750" w:type="dxa"/>
+            <w:tcMar/>
           </w:tcPr>
           <w:p>
             <w:pPr>
@@ -26829,9 +26806,8 @@
         </w:trPr>
         <w:tc>
           <w:tcPr>
-            <w:tcW w:w="4386" w:type="dxa"/>
-            <w:tcMar/>
-            <w:vAlign w:val="center"/>
+            <w:tcW w:w="4740" w:type="dxa"/>
+            <w:tcMar/>
           </w:tcPr>
           <w:p>
             <w:pPr>
@@ -26846,9 +26822,8 @@
         </w:tc>
         <w:tc>
           <w:tcPr>
-            <w:tcW w:w="2360" w:type="dxa"/>
-            <w:tcMar/>
-            <w:vAlign w:val="center"/>
+            <w:tcW w:w="3750" w:type="dxa"/>
+            <w:tcMar/>
           </w:tcPr>
           <w:p>
             <w:pPr>
@@ -26868,9 +26843,8 @@
         </w:trPr>
         <w:tc>
           <w:tcPr>
-            <w:tcW w:w="4386" w:type="dxa"/>
-            <w:tcMar/>
-            <w:vAlign w:val="center"/>
+            <w:tcW w:w="4740" w:type="dxa"/>
+            <w:tcMar/>
           </w:tcPr>
           <w:p>
             <w:pPr>
@@ -26885,9 +26859,8 @@
         </w:tc>
         <w:tc>
           <w:tcPr>
-            <w:tcW w:w="2360" w:type="dxa"/>
-            <w:tcMar/>
-            <w:vAlign w:val="center"/>
+            <w:tcW w:w="3750" w:type="dxa"/>
+            <w:tcMar/>
           </w:tcPr>
           <w:p>
             <w:pPr>
@@ -26902,6 +26875,112 @@
         </w:tc>
       </w:tr>
     </w:tbl>
+    <w:p>
+      <w:pPr>
+        <w:pStyle w:val="Normal"/>
+        <w:suppressLineNumbers w:val="0"/>
+        <w:bidi w:val="0"/>
+        <w:spacing w:before="240" w:beforeAutospacing="off" w:after="240" w:afterAutospacing="off" w:line="259" w:lineRule="auto"/>
+        <w:ind w:left="0" w:right="0"/>
+        <w:jc w:val="left"/>
+        <w:rPr>
+          <w:rFonts w:ascii="Calibri" w:hAnsi="Calibri" w:eastAsia="Calibri" w:cs="Calibri"/>
+          <w:noProof w:val="0"/>
+          <w:sz w:val="22"/>
+          <w:szCs w:val="22"/>
+          <w:lang w:val="es-ES"/>
+        </w:rPr>
+      </w:pPr>
+      <w:r>
+        <w:rPr>
+          <w:rFonts w:ascii="Calibri" w:hAnsi="Calibri" w:eastAsia="Calibri" w:cs="Calibri"/>
+          <w:noProof w:val="0"/>
+          <w:sz w:val="22"/>
+          <w:szCs w:val="22"/>
+          <w:lang w:val="es-ES"/>
+        </w:rPr>
+        <w:t xml:space="preserve">La cobertura de métodos y líneas es alta porque se ejercitan los constructores, operaciones principales de los </w:t>
+      </w:r>
+      <w:r>
+        <w:rPr>
+          <w:rFonts w:ascii="Calibri" w:hAnsi="Calibri" w:eastAsia="Calibri" w:cs="Calibri"/>
+          <w:noProof w:val="0"/>
+          <w:sz w:val="22"/>
+          <w:szCs w:val="22"/>
+          <w:lang w:val="es-ES"/>
+        </w:rPr>
+        <w:t>DAOs</w:t>
+      </w:r>
+      <w:r>
+        <w:rPr>
+          <w:rFonts w:ascii="Calibri" w:hAnsi="Calibri" w:eastAsia="Calibri" w:cs="Calibri"/>
+          <w:noProof w:val="0"/>
+          <w:sz w:val="22"/>
+          <w:szCs w:val="22"/>
+          <w:lang w:val="es-ES"/>
+        </w:rPr>
+        <w:t xml:space="preserve"> y métodos de negocio. La cobertura de ramas es ligeramente inferior, ya que algunos métodos contienen condiciones compuestas y validaciones encadenadas que requieren casos muy específicos, como </w:t>
+      </w:r>
+      <w:r>
+        <w:rPr>
+          <w:rFonts w:ascii="Calibri" w:hAnsi="Calibri" w:eastAsia="Calibri" w:cs="Calibri"/>
+          <w:noProof w:val="0"/>
+          <w:sz w:val="22"/>
+          <w:szCs w:val="22"/>
+          <w:lang w:val="es-ES"/>
+        </w:rPr>
+        <w:t>Double.NaN</w:t>
+      </w:r>
+      <w:r>
+        <w:rPr>
+          <w:rFonts w:ascii="Calibri" w:hAnsi="Calibri" w:eastAsia="Calibri" w:cs="Calibri"/>
+          <w:noProof w:val="0"/>
+          <w:sz w:val="22"/>
+          <w:szCs w:val="22"/>
+          <w:lang w:val="es-ES"/>
+        </w:rPr>
+        <w:t>, infinito o búsquedas con varios elementos en la lista.</w:t>
+      </w:r>
+    </w:p>
+    <w:p>
+      <w:pPr>
+        <w:numPr>
+          <w:ilvl w:val="0"/>
+          <w:numId w:val="0"/>
+        </w:numPr>
+        <w:bidi w:val="0"/>
+      </w:pPr>
+    </w:p>
+    <w:p>
+      <w:pPr>
+        <w:pStyle w:val="Ttulo2"/>
+        <w:bidi w:val="0"/>
+        <w:spacing w:before="299" w:beforeAutospacing="off" w:after="299" w:afterAutospacing="off"/>
+        <w:rPr>
+          <w:rFonts w:ascii="Calibri" w:hAnsi="Calibri" w:eastAsia="Calibri" w:cs="Calibri"/>
+          <w:b w:val="0"/>
+          <w:bCs w:val="0"/>
+          <w:noProof w:val="0"/>
+          <w:sz w:val="28"/>
+          <w:szCs w:val="28"/>
+          <w:lang w:val="es-ES"/>
+        </w:rPr>
+      </w:pPr>
+      <w:bookmarkStart w:name="_Toc969010519" w:id="33947198"/>
+      <w:r>
+        <w:rPr>
+          <w:rFonts w:ascii="Calibri" w:hAnsi="Calibri" w:eastAsia="Calibri" w:cs="Calibri"/>
+          <w:b w:val="0"/>
+          <w:bCs w:val="0"/>
+          <w:noProof w:val="0"/>
+          <w:sz w:val="28"/>
+          <w:szCs w:val="28"/>
+          <w:lang w:val="es-ES"/>
+        </w:rPr>
+        <w:t>Fallos detectados y correcciones</w:t>
+      </w:r>
+      <w:bookmarkEnd w:id="33947198"/>
+    </w:p>
     <w:p>
       <w:pPr>
         <w:numPr>
@@ -26919,78 +26998,19 @@
           <w:szCs w:val="22"/>
           <w:lang w:val="es-ES"/>
         </w:rPr>
-        <w:t>La cobertura de métodos y líneas es alta porque se ejercitan los constructores, operaciones principales de los DAOs y métodos de negocio. La cobertura de ramas es ligeramente inferior, ya que algunos métodos contienen condiciones compuestas y validaciones encadenadas que requieren casos muy específicos, como Double.NaN, infinito o búsquedas con varios elementos en la lista.</w:t>
-      </w:r>
-    </w:p>
-    <w:p>
-      <w:pPr>
-        <w:numPr>
-          <w:ilvl w:val="0"/>
-          <w:numId w:val="0"/>
-        </w:numPr>
-        <w:bidi w:val="0"/>
-      </w:pPr>
-    </w:p>
-    <w:p>
-      <w:pPr>
-        <w:pStyle w:val="Ttulo2"/>
-        <w:bidi w:val="0"/>
-        <w:spacing w:before="299" w:beforeAutospacing="off" w:after="299" w:afterAutospacing="off"/>
-        <w:rPr>
-          <w:rFonts w:ascii="Calibri" w:hAnsi="Calibri" w:eastAsia="Calibri" w:cs="Calibri"/>
-          <w:b w:val="0"/>
-          <w:bCs w:val="0"/>
-          <w:noProof w:val="0"/>
-          <w:sz w:val="28"/>
-          <w:szCs w:val="28"/>
-          <w:lang w:val="es-ES"/>
-        </w:rPr>
-      </w:pPr>
-      <w:bookmarkStart w:name="_Toc969010519" w:id="33947198"/>
-      <w:r>
-        <w:rPr>
-          <w:rFonts w:ascii="Calibri" w:hAnsi="Calibri" w:eastAsia="Calibri" w:cs="Calibri"/>
-          <w:b w:val="0"/>
-          <w:bCs w:val="0"/>
-          <w:noProof w:val="0"/>
-          <w:sz w:val="28"/>
-          <w:szCs w:val="28"/>
-          <w:lang w:val="es-ES"/>
-        </w:rPr>
-        <w:t>Fallos detectados y correcciones</w:t>
-      </w:r>
-      <w:bookmarkEnd w:id="33947198"/>
-    </w:p>
-    <w:p>
-      <w:pPr>
-        <w:numPr>
-          <w:ilvl w:val="0"/>
-          <w:numId w:val="0"/>
-        </w:numPr>
-        <w:bidi w:val="0"/>
-        <w:spacing w:before="240" w:beforeAutospacing="off" w:after="240" w:afterAutospacing="off"/>
-      </w:pPr>
-      <w:r>
-        <w:rPr>
-          <w:rFonts w:ascii="Calibri" w:hAnsi="Calibri" w:eastAsia="Calibri" w:cs="Calibri"/>
-          <w:noProof w:val="0"/>
-          <w:sz w:val="22"/>
-          <w:szCs w:val="22"/>
-          <w:lang w:val="es-ES"/>
-        </w:rPr>
         <w:t>Durante la revisión del diseño de pruebas se detectaron algunos desajustes entre la documentación inicial y el código real:</w:t>
       </w:r>
     </w:p>
     <w:tbl>
       <w:tblPr>
-        <w:tblStyle w:val="Tablanormal"/>
+        <w:tblStyle w:val="Tablaconcuadrcula"/>
         <w:bidiVisual w:val="0"/>
         <w:tblW w:w="0" w:type="auto"/>
         <w:tblLook w:val="06A0" w:firstRow="1" w:lastRow="0" w:firstColumn="1" w:lastColumn="0" w:noHBand="1" w:noVBand="1"/>
       </w:tblPr>
       <w:tblGrid>
-        <w:gridCol w:w="4368"/>
-        <w:gridCol w:w="4122"/>
+        <w:gridCol w:w="4365"/>
+        <w:gridCol w:w="4125"/>
       </w:tblGrid>
       <w:tr>
         <w:trPr>
@@ -26998,9 +27018,8 @@
         </w:trPr>
         <w:tc>
           <w:tcPr>
-            <w:tcW w:w="4368" w:type="dxa"/>
-            <w:tcMar/>
-            <w:vAlign w:val="center"/>
+            <w:tcW w:w="4365" w:type="dxa"/>
+            <w:tcMar/>
           </w:tcPr>
           <w:p>
             <w:pPr>
@@ -27019,9 +27038,8 @@
         </w:tc>
         <w:tc>
           <w:tcPr>
-            <w:tcW w:w="4122" w:type="dxa"/>
-            <w:tcMar/>
-            <w:vAlign w:val="center"/>
+            <w:tcW w:w="4125" w:type="dxa"/>
+            <w:tcMar/>
           </w:tcPr>
           <w:p>
             <w:pPr>
@@ -27045,9 +27063,8 @@
         </w:trPr>
         <w:tc>
           <w:tcPr>
-            <w:tcW w:w="4368" w:type="dxa"/>
-            <w:tcMar/>
-            <w:vAlign w:val="center"/>
+            <w:tcW w:w="4365" w:type="dxa"/>
+            <w:tcMar/>
           </w:tcPr>
           <w:p>
             <w:pPr>
@@ -27062,9 +27079,8 @@
         </w:tc>
         <w:tc>
           <w:tcPr>
-            <w:tcW w:w="4122" w:type="dxa"/>
-            <w:tcMar/>
-            <w:vAlign w:val="center"/>
+            <w:tcW w:w="4125" w:type="dxa"/>
+            <w:tcMar/>
           </w:tcPr>
           <w:p>
             <w:pPr>
@@ -27084,9 +27100,8 @@
         </w:trPr>
         <w:tc>
           <w:tcPr>
-            <w:tcW w:w="4368" w:type="dxa"/>
-            <w:tcMar/>
-            <w:vAlign w:val="center"/>
+            <w:tcW w:w="4365" w:type="dxa"/>
+            <w:tcMar/>
           </w:tcPr>
           <w:p>
             <w:pPr>
@@ -27101,9 +27116,8 @@
         </w:tc>
         <w:tc>
           <w:tcPr>
-            <w:tcW w:w="4122" w:type="dxa"/>
-            <w:tcMar/>
-            <w:vAlign w:val="center"/>
+            <w:tcW w:w="4125" w:type="dxa"/>
+            <w:tcMar/>
           </w:tcPr>
           <w:p>
             <w:pPr>
@@ -27123,9 +27137,8 @@
         </w:trPr>
         <w:tc>
           <w:tcPr>
-            <w:tcW w:w="4368" w:type="dxa"/>
-            <w:tcMar/>
-            <w:vAlign w:val="center"/>
+            <w:tcW w:w="4365" w:type="dxa"/>
+            <w:tcMar/>
           </w:tcPr>
           <w:p>
             <w:pPr>
@@ -27140,9 +27153,8 @@
         </w:tc>
         <w:tc>
           <w:tcPr>
-            <w:tcW w:w="4122" w:type="dxa"/>
-            <w:tcMar/>
-            <w:vAlign w:val="center"/>
+            <w:tcW w:w="4125" w:type="dxa"/>
+            <w:tcMar/>
           </w:tcPr>
           <w:p>
             <w:pPr>
@@ -27162,9 +27174,8 @@
         </w:trPr>
         <w:tc>
           <w:tcPr>
-            <w:tcW w:w="4368" w:type="dxa"/>
-            <w:tcMar/>
-            <w:vAlign w:val="center"/>
+            <w:tcW w:w="4365" w:type="dxa"/>
+            <w:tcMar/>
           </w:tcPr>
           <w:p>
             <w:pPr>
@@ -27179,9 +27190,8 @@
         </w:tc>
         <w:tc>
           <w:tcPr>
-            <w:tcW w:w="4122" w:type="dxa"/>
-            <w:tcMar/>
-            <w:vAlign w:val="center"/>
+            <w:tcW w:w="4125" w:type="dxa"/>
+            <w:tcMar/>
           </w:tcPr>
           <w:p>
             <w:pPr>
@@ -27201,9 +27211,8 @@
         </w:trPr>
         <w:tc>
           <w:tcPr>
-            <w:tcW w:w="4368" w:type="dxa"/>
-            <w:tcMar/>
-            <w:vAlign w:val="center"/>
+            <w:tcW w:w="4365" w:type="dxa"/>
+            <w:tcMar/>
           </w:tcPr>
           <w:p>
             <w:pPr>
@@ -27218,9 +27227,8 @@
         </w:tc>
         <w:tc>
           <w:tcPr>
-            <w:tcW w:w="4122" w:type="dxa"/>
-            <w:tcMar/>
-            <w:vAlign w:val="center"/>
+            <w:tcW w:w="4125" w:type="dxa"/>
+            <w:tcMar/>
           </w:tcPr>
           <w:p>
             <w:pPr>
@@ -27237,14 +27245,12 @@
     </w:tbl>
     <w:p>
       <w:pPr>
-        <w:numPr>
-          <w:ilvl w:val="0"/>
-          <w:numId w:val="0"/>
-        </w:numPr>
+        <w:pStyle w:val="Normal"/>
+        <w:suppressLineNumbers w:val="0"/>
         <w:bidi w:val="0"/>
-        <w:spacing w:before="240" w:beforeAutospacing="off" w:after="240" w:afterAutospacing="off"/>
-      </w:pPr>
-      <w:r>
+        <w:spacing w:before="240" w:beforeAutospacing="off" w:after="240" w:afterAutospacing="off" w:line="259" w:lineRule="auto"/>
+        <w:ind w:left="0" w:right="0"/>
+        <w:jc w:val="left"/>
         <w:rPr>
           <w:rFonts w:ascii="Calibri" w:hAnsi="Calibri" w:eastAsia="Calibri" w:cs="Calibri"/>
           <w:noProof w:val="0"/>
@@ -27252,7 +27258,36 @@
           <w:szCs w:val="22"/>
           <w:lang w:val="es-ES"/>
         </w:rPr>
-        <w:t>Estas correcciones no implican necesariamente errores funcionales en el código, sino ajustes en el diseño documental y en la trazabilidad entre historias, pruebas y clases JUnit.</w:t>
+      </w:pPr>
+      <w:r>
+        <w:rPr>
+          <w:rFonts w:ascii="Calibri" w:hAnsi="Calibri" w:eastAsia="Calibri" w:cs="Calibri"/>
+          <w:noProof w:val="0"/>
+          <w:sz w:val="22"/>
+          <w:szCs w:val="22"/>
+          <w:lang w:val="es-ES"/>
+        </w:rPr>
+        <w:t xml:space="preserve">Estas correcciones no implican necesariamente errores funcionales en el código, sino ajustes en el diseño documental y en la trazabilidad entre historias, pruebas y clases </w:t>
+      </w:r>
+      <w:r>
+        <w:rPr>
+          <w:rFonts w:ascii="Calibri" w:hAnsi="Calibri" w:eastAsia="Calibri" w:cs="Calibri"/>
+          <w:noProof w:val="0"/>
+          <w:sz w:val="22"/>
+          <w:szCs w:val="22"/>
+          <w:lang w:val="es-ES"/>
+        </w:rPr>
+        <w:t>JUnit</w:t>
+      </w:r>
+      <w:r>
+        <w:rPr>
+          <w:rFonts w:ascii="Calibri" w:hAnsi="Calibri" w:eastAsia="Calibri" w:cs="Calibri"/>
+          <w:noProof w:val="0"/>
+          <w:sz w:val="22"/>
+          <w:szCs w:val="22"/>
+          <w:lang w:val="es-ES"/>
+        </w:rPr>
+        <w:t>.</w:t>
       </w:r>
     </w:p>
     <w:p>
@@ -44058,7 +44093,7 @@
       </w:pPr>
       <w:r>
         <w:drawing>
-          <wp:inline wp14:editId="33575AF3" wp14:anchorId="15E2A95D">
+          <wp:inline wp14:editId="1758F8B6" wp14:anchorId="15E2A95D">
             <wp:extent cx="5400675" cy="2552700"/>
             <wp:effectExtent l="0" t="0" r="0" b="0"/>
             <wp:docPr id="50391967" name="drawing"/>
@@ -45028,7 +45063,7 @@
       </w:pPr>
       <w:r>
         <w:drawing>
-          <wp:inline wp14:editId="25B1A8BF" wp14:anchorId="2A1EA5C5">
+          <wp:inline wp14:editId="7F602C27" wp14:anchorId="2A1EA5C5">
             <wp:extent cx="4676775" cy="4171950"/>
             <wp:effectExtent l="0" t="0" r="0" b="0"/>
             <wp:docPr id="2095940515" name="drawing"/>
@@ -46885,7 +46920,7 @@
       </w:pPr>
       <w:r>
         <w:drawing>
-          <wp:inline wp14:editId="632E636F" wp14:anchorId="7CA2E68A">
+          <wp:inline wp14:editId="34A2D093" wp14:anchorId="7CA2E68A">
             <wp:extent cx="2381250" cy="5400675"/>
             <wp:effectExtent l="0" t="0" r="0" b="0"/>
             <wp:docPr id="1986654992" name="drawing"/>
@@ -48658,7 +48693,7 @@
       </w:pPr>
       <w:r>
         <w:drawing>
-          <wp:inline wp14:editId="7E29D6BB" wp14:anchorId="0717F079">
+          <wp:inline wp14:editId="653275EA" wp14:anchorId="0717F079">
             <wp:extent cx="2462305" cy="5076825"/>
             <wp:effectExtent l="0" t="0" r="0" b="0"/>
             <wp:docPr id="7978803" name="drawing"/>
@@ -49702,7 +49737,7 @@
       </w:pPr>
       <w:r>
         <w:drawing>
-          <wp:inline wp14:editId="030379FE" wp14:anchorId="4C2F0229">
+          <wp:inline wp14:editId="51AA5401" wp14:anchorId="4C2F0229">
             <wp:extent cx="2549659" cy="4448175"/>
             <wp:effectExtent l="0" t="0" r="0" b="0"/>
             <wp:docPr id="1051294515" name="drawing"/>
@@ -51548,7 +51583,7 @@
       </w:pPr>
       <w:r>
         <w:drawing>
-          <wp:inline wp14:editId="59570EFB" wp14:anchorId="5A9ACF22">
+          <wp:inline wp14:editId="5ECEA0D9" wp14:anchorId="5A9ACF22">
             <wp:extent cx="5400675" cy="2057400"/>
             <wp:effectExtent l="0" t="0" r="0" b="0"/>
             <wp:docPr id="1959701512" name="drawing"/>
@@ -53320,7 +53355,7 @@
       </w:pPr>
       <w:r>
         <w:drawing>
-          <wp:inline wp14:editId="2D15C14E" wp14:anchorId="3F57AE0D">
+          <wp:inline wp14:editId="5FFC8D05" wp14:anchorId="3F57AE0D">
             <wp:extent cx="4352925" cy="2387583"/>
             <wp:effectExtent l="0" t="0" r="0" b="0"/>
             <wp:docPr id="803138072" name="drawing" title="https://plantuml.online/png/ZL5BJiCm4Dtx52EnIHPKQccXjAfGWKRg9YTWOyMJP5J73lvGUXmEm8e38D6BuQHD5G42nWlRu_TctXlR3QcQ6rw1m9nxwHAjNCehXAKXBfazlI-DqTixBRM1it4R_SVCqHEvtQqs0isVA9vj2gEz4aTaCcdM3yXxufLMuZiXIQQhuI-4lexaUZaTJHYpZXl7s2mTmZcGeepqW-92HBNHmcTEntF6A8Se7GL0buJ50fINyYO6LwA2oEvVOmOmIoy2ofLXAh2M4WikbwRm5IgtUiwmTgJLFE2iqpL3QH4YfHlYjYGPBkauqFEW3tbMGWsXTDVIFgYFzvBleDg_M429JL5jWmAof_u0hTJBHkgWGBSMKJp0Hy-bFHdgyd6dtHcF1t9ZuEfV1ffeJJI7Wv4yDEdLcOOwbWfFWOf03WtFQFzsPACIbBDsFre_p66MJdfZjeClFz5DhcL_0W00"/>
@@ -54607,8 +54642,8 @@
       <w:pgMar w:top="1417" w:right="1701" w:bottom="1417" w:left="1701" w:header="708" w:footer="708" w:gutter="0"/>
       <w:cols w:space="708"/>
       <w:docGrid w:linePitch="360"/>
-      <w:headerReference w:type="default" r:id="R0c8732c8facc44d9"/>
-      <w:footerReference w:type="default" r:id="R1052453a90f04564"/>
+      <w:headerReference w:type="default" r:id="R44b555e7aec7481b"/>
+      <w:footerReference w:type="default" r:id="Rfdad1b98e0ed4e2f"/>
     </w:sectPr>
   </w:body>
 </w:document>
@@ -60621,7 +60656,7 @@
     <w:name w:val="header"/>
     <w:basedOn w:val="Normal"/>
     <w:unhideWhenUsed/>
-    <w:rsid w:val="2E7B7607"/>
+    <w:rsid w:val="3DED8062"/>
     <w:pPr>
       <w:tabs>
         <w:tab w:val="center" w:leader="none" w:pos="4680"/>
@@ -60635,7 +60670,7 @@
     <w:name w:val="footer"/>
     <w:basedOn w:val="Normal"/>
     <w:unhideWhenUsed/>
-    <w:rsid w:val="2E7B7607"/>
+    <w:rsid w:val="3DED8062"/>
     <w:pPr>
       <w:tabs>
         <w:tab w:val="center" w:leader="none" w:pos="4680"/>

</xml_diff>